<commit_message>
Refine dissertation chapters with updated SHAP analysis and methodology details. Clarify hypotheses, including specific model comparisons and statistical tests. Adjust figures and tables for improved clarity, and enhance the narrative on explanation stability and data limitations. Update binary report files for final submission.
</commit_message>
<xml_diff>
--- a/docs/reports/PP_XAI_Dissertation_Assignment2.docx
+++ b/docs/reports/PP_XAI_Dissertation_Assignment2.docx
@@ -353,7 +353,7 @@
     </w:p>
     <w:p>
       <w:pPr>
-        <w:pStyle w:val="Heading1"/>
+        <w:pStyle w:val="Headingfrontmatter"/>
         <w:spacing w:after="200" w:before="400"/>
       </w:pPr>
       <w:r>
@@ -402,7 +402,7 @@
           <w:sz w:val="24"/>
           <w:szCs w:val="24"/>
         </w:rPr>
-        <w:t xml:space="preserve">After auditing bulk export schemas, high-rise filters were revised: domestic flats with storey count ≥ 5 in London, Manchester, and Birmingham client partitions, and non-domestic buildings with floor area ≥ 5,000 m² excluding institutional types. Target-leaking emissions features were excluded to preserve scientific integrity. On 5,663 filtered records drawn from over 14 million scanned certificates, centralised gradient boosting achieved R² ≈ 0.559 (RMSE 113.04); a federated MLP reached R² ≈ 0.517 (RMSE 118.32) after eight rounds, closely matching a centralised MLP (R² 0.528). Spearman rank correlation of mean absolute SHAP values between centralised and federated models was ρ ≈ 0.956 (p &lt; 0.001). Statistical tests (Wilcoxon p = 1.06 × 10⁻⁵; paired t-test p = 4.98 × 10⁻⁵) confirm the accuracy gap, whilst its practical magnitude is modest relative to the privacy benefit.</w:t>
+        <w:t>After auditing bulk export schemas, high-rise filters were revised: domestic flats with storey count ≥ 5 in London, Manchester, and Birmingham client partitions, and non-domestic buildings with floor area ≥ 5,000 m² excluding institutional types. Target-leaking emissions features were excluded to preserve scientific integrity. On 5,663 filtered records drawn from over 14 million scanned certificates, centralised gradient boosting achieved R² ≈ 0.559 (RMSE 113.04); a federated MLP reached R² ≈ 0.518 (RMSE 118.21) after eight rounds, closely matching a centralised MLP (R² 0.528). Spearman rank correlation of mean absolute SHAP values between centralised Gradient Boosting and the federated MLP was ρ ≈ 0.956 (p &lt; 0.001). Statistical tests (Wilcoxon p = 1.85 × 10⁻⁵; paired t-test p = 7.97 × 10⁻⁵) confirm the accuracy gap, whilst its practical magnitude is modest relative to the privacy benefit.</w:t>
       </w:r>
     </w:p>
     <w:p>
@@ -465,7 +465,7 @@
     </w:p>
     <w:p>
       <w:pPr>
-        <w:pStyle w:val="Heading1"/>
+        <w:pStyle w:val="Headingfrontmatter"/>
         <w:spacing w:after="200" w:before="400"/>
       </w:pPr>
       <w:r>
@@ -532,7 +532,7 @@
           <w:sz w:val="24"/>
           <w:szCs w:val="24"/>
         </w:rPr>
-        <w:t xml:space="preserve">Development was assisted by Cursor IDE with AI code-generation support; all experimental judgements, filter decisions, and analytical conclusions are my own.</w:t>
+        <w:t>Development used Python 3.13 with NumPy, pandas, scikit-learn, XGBoost, LightGBM, PyTorch, Flower (flwr), SHAP, LIME, SciPy, Optuna, Matplotlib/Seaborn, GeoPandas, and Streamlit, as specified in requirements.txt. Cursor IDE with AI code-generation assistance was used during development. All experimental judgements, filter decisions, and analytical conclusions are my own.</w:t>
       </w:r>
     </w:p>
     <w:p>
@@ -608,7 +608,7 @@
           <w:sz w:val="24"/>
           <w:szCs w:val="24"/>
         </w:rPr>
-        <w:t xml:space="preserve">High-rise buildings occupy a distinctive position within this stock. Residential tower blocks concentrate many dwellings under a shared envelope and services strategy, raising both energy-intensity questions and strong privacy concerns: individual flat-level certificates can reveal occupancy-related patterns that engage GDPR protections (McMahan et al., 2017). Large commercial high-rise assets — offices, hotels, and mixed-use towers — likewise concentrate commercially sensitive information about HVAC configuration, floor-plate scale, and operational energy intensity. Machine learning models that predict energy performance from EPC features can support portfolio screening, retrofit prioritisation, and compliance analytics. However, conventional centralised training assumes that microdata can be pooled in a single repository, which for councils, housing associations, and commercial landlords may be organisationally or legally constrained.</w:t>
+        <w:t>High-rise buildings occupy a distinctive position within this stock. Residential tower blocks concentrate many dwellings under a shared envelope and services strategy, raising both energy-intensity questions and strong privacy concerns: individual flat-level certificates can reveal occupancy-related patterns that engage GDPR protections. Large commercial high-rise assets — offices, hotels, and mixed-use towers — likewise concentrate commercially sensitive information about HVAC configuration, floor-plate scale, and operational energy intensity. Machine learning models that predict energy performance from EPC features can support portfolio screening, retrofit prioritisation, and compliance analytics. However, conventional centralised training assumes that microdata can be pooled in a single repository, which for councils, housing associations, and commercial landlords may be organisationally or legally constrained.</w:t>
       </w:r>
     </w:p>
     <w:p>
@@ -2410,6 +2410,51 @@
           <w:szCs w:val="24"/>
         </w:rPr>
         <w:t xml:space="preserve">The research paradigm is positivist and quantitative: propositions (hypotheses H1–H4) are tested with numerical metrics and statistical tests. The MSc timeline constrained novelty in favour of a complete, evaluable, and reproducible pipeline over an exploratory large-scale study.</w:t>
+      </w:r>
+    </w:p>
+    <w:p>
+      <w:r>
+        <w:rPr>
+          <w:rFonts w:ascii="Times New Roman" w:hAnsi="Times New Roman"/>
+          <w:sz w:val="22"/>
+        </w:rPr>
+        <w:t>The following hypotheses operationalise the research questions:</w:t>
+      </w:r>
+    </w:p>
+    <w:p>
+      <w:r>
+        <w:rPr>
+          <w:rFonts w:ascii="Times New Roman" w:hAnsi="Times New Roman"/>
+          <w:sz w:val="22"/>
+        </w:rPr>
+        <w:t>H1: Federated Averaging achieves test RMSE within 5% of the centralised MLP on the same held-out set.</w:t>
+      </w:r>
+    </w:p>
+    <w:p>
+      <w:r>
+        <w:rPr>
+          <w:rFonts w:ascii="Times New Roman" w:hAnsi="Times New Roman"/>
+          <w:sz w:val="22"/>
+        </w:rPr>
+        <w:t>H2: Spearman rank correlation of mean |SHAP| profiles between the centralised Gradient Boosting model and the federated MLP exceeds 0.85.</w:t>
+      </w:r>
+    </w:p>
+    <w:p>
+      <w:r>
+        <w:rPr>
+          <w:rFonts w:ascii="Times New Roman" w:hAnsi="Times New Roman"/>
+          <w:sz w:val="22"/>
+        </w:rPr>
+        <w:t>H3: Pairwise Jaccard similarity of per-client top-5 SHAP feature sets exceeds 0.60 on average (primary pass criterion). A secondary check requires that at least four of the five leading features appear in all three city clients (equivalent to ≥80% of the top-5 set under a three-client design).</w:t>
+      </w:r>
+    </w:p>
+    <w:p>
+      <w:r>
+        <w:rPr>
+          <w:rFonts w:ascii="Times New Roman" w:hAnsi="Times New Roman"/>
+          <w:sz w:val="22"/>
+        </w:rPr>
+        <w:t>H4: The Streamlit prototype can present SHAP/LIME outputs with an EU AI Act Article 13 transparency note suitable for stakeholder demonstration.</w:t>
       </w:r>
     </w:p>
     <w:p>
@@ -3265,7 +3310,7 @@
           <w:sz w:val="24"/>
           <w:szCs w:val="24"/>
         </w:rPr>
-        <w:t xml:space="preserve">Five regression models are implemented in src/models/centralised_models.py as centralised baselines: Random Forest Regressor (200 estimators), Gradient Boosting (sklearn), XGBoost (lightly tuned), LightGBM (single-threaded for macOS stability), and MLPRegressor (128–64 hidden units, early stopping). Evaluation metrics are RMSE, MAE, R², and MAPE on the 20% held-out test set. The best-performing model by RMSE is designated for primary SHAP comparison.</w:t>
+        <w:t>Five regression models are implemented in src/models/centralised_models.py as centralised baselines: Random Forest Regressor (200 estimators), Gradient Boosting (sklearn), XGBoost (lightly tuned), LightGBM (single-threaded for macOS stability), and MLPRegressor (128–64 hidden units, early stopping). Evaluation metrics are RMSE, MAE, R², and MAPE on the 20% held-out test set. The best-performing model by RMSE (Gradient Boosting) is designated for the primary KernelSHAP comparison versus the federated MLP. A supplementary figure compares federated weighted SHAP with centralised Random Forest attributions.</w:t>
       </w:r>
     </w:p>
     <w:p>
@@ -3335,7 +3380,7 @@
           <w:sz w:val="24"/>
           <w:szCs w:val="24"/>
         </w:rPr>
-        <w:t xml:space="preserve">On a shared subsample (background ≈ 80 training rows; explain ≈ 60 test rows), SHAP KernelExplainer is applied to both the best centralised model and the federated MLP. Using the same explainer family on both models reduces confounding from explainer choice and enables a fair comparison of mean absolute SHAP value profiles. LIME tabular explanations are generated for three representative test instances per model. Explanation stability is quantified as:</w:t>
+        <w:t>On a shared subsample (background ≈ 80 training rows; explain ≈ 60 test rows), SHAP KernelExplainer is applied to both the best centralised model (Gradient Boosting) and the federated MLP. Using the same explainer family on both models reduces confounding from explainer choice and enables a fair comparison of mean absolute SHAP value profiles. LIME tabular explanations are generated for three representative test instances per model. Explanation stability (H2) is quantified as the Spearman rank correlation of mean |SHAP| profiles between Gradient Boosting and the federated MLP (target ρ &gt; 0.85; scripts/run_xai.py). A supplementary comparison of federated weighted SHAP against centralised Random Forest attributions is produced by scripts/run_federated_shap.py and is not the H2 test statistic. Separately, Hypothesis H3 is tested by applying the centralised Gradient Boosting model to each city client matrix and computing TreeExplainer mean |SHAP| rankings per client, then measuring pairwise Jaccard overlap of the top-5 feature sets (scripts/run_h3_per_client_shap.py).</w:t>
       </w:r>
     </w:p>
     <w:p>
@@ -3358,19 +3403,18 @@
           <w:sz w:val="24"/>
           <w:szCs w:val="24"/>
         </w:rPr>
-        <w:t xml:space="preserve">Spearman Rank Correlation (ρ):</w:t>
-      </w:r>
-      <w:r>
-        <w:rPr>
-          <w:rFonts w:ascii="Times New Roman" w:cs="Times New Roman" w:eastAsia="Times New Roman" w:hAnsi="Times New Roman"/>
-          <w:b w:val="false"/>
-          <w:bCs w:val="false"/>
-          <w:caps w:val="false"/>
-          <w:color w:val="000000"/>
-          <w:sz w:val="24"/>
-          <w:szCs w:val="24"/>
-        </w:rPr>
-        <w:t xml:space="preserve"> Correlation between ranked mean |SHAP| profiles of centralised and federated models. Target: ρ &gt; 0.85. A high ρ indicates feature importance rankings are similarly ordered across training regimes.</w:t>
+        <w:t>Spearman Rank Correlation (ρ): Correlation between ranked mean |SHAP| profiles of the centralised Gradient Boosting model and the federated MLP. Target: ρ &gt; 0.85. A high ρ indicates feature importance rankings are similarly ordered across those two training regimes.</w:t>
+      </w:r>
+      <w:r>
+        <w:rPr>
+          <w:rFonts w:ascii="Times New Roman" w:cs="Times New Roman" w:eastAsia="Times New Roman" w:hAnsi="Times New Roman"/>
+          <w:b w:val="false"/>
+          <w:bCs w:val="false"/>
+          <w:caps w:val="false"/>
+          <w:color w:val="000000"/>
+          <w:sz w:val="24"/>
+          <w:szCs w:val="24"/>
+        </w:rPr>
       </w:r>
     </w:p>
     <w:p>
@@ -3405,7 +3449,7 @@
           <w:sz w:val="24"/>
           <w:szCs w:val="24"/>
         </w:rPr>
-        <w:t xml:space="preserve">Paired Wilcoxon signed-rank test and paired t-test compare absolute errors of the best centralised model versus the federated MLP on the identical test set. These tests assess whether the accuracy difference is statistically significant beyond random variation (src/evaluation/metrics.py). Effect size (Cohen's d) is also computed to complement p-values.</w:t>
+        <w:t>Paired Wilcoxon signed-rank test and paired t-test compare absolute errors of the best centralised model versus the federated MLP on the identical test set. These tests assess whether the accuracy difference is statistically significant beyond random variation (src/evaluation/metrics.py). Effect size (Cohen's d) is also computed to complement p-values. Additionally, bootstrap percentile 95% confidence intervals (2,000 resamples) are computed for RMSE of both models to assess whether the accuracy gap is robust relative to sampling variability (scripts/run_bootstrap_ci.py).</w:t>
       </w:r>
     </w:p>
     <w:p>
@@ -4278,9 +4322,230 @@
           <w:sz w:val="24"/>
           <w:szCs w:val="24"/>
         </w:rPr>
-        <w:t xml:space="preserve">Preprocessing yielded 4,439 training and 1,110 test samples with 87 one-hot-expanded features after encoding. The 99.4% commercial composition reflects the sparsity of domestic storey metadata in bulk EPC exports — a key finding discussed in Chapter 5.</w:t>
-      </w:r>
-    </w:p>
+        <w:t>After non-positive target removal and 1st–99th percentile clipping, 5,549 of the 5,663 filtered records remained. An 80/20 split then produced 4,439 training and 1,110 test samples with 87 one-hot-expanded features after encoding. The 99.4% commercial composition reflects the sparsity of domestic storey metadata in bulk EPC exports — a key finding discussed in Chapter 5.</w:t>
+      </w:r>
+    </w:p>
+    <w:p/>
+    <w:p>
+      <w:pPr>
+        <w:jc w:val="center"/>
+      </w:pPr>
+      <w:r>
+        <w:drawing>
+          <wp:inline xmlns:a="http://schemas.openxmlformats.org/drawingml/2006/main" xmlns:pic="http://schemas.openxmlformats.org/drawingml/2006/picture">
+            <wp:extent cx="4320000" cy="2160000"/>
+            <wp:docPr id="2" name="Picture 2"/>
+            <wp:cNvGraphicFramePr>
+              <a:graphicFrameLocks noChangeAspect="1"/>
+            </wp:cNvGraphicFramePr>
+            <a:graphic>
+              <a:graphicData uri="http://schemas.openxmlformats.org/drawingml/2006/picture">
+                <pic:pic>
+                  <pic:nvPicPr>
+                    <pic:cNvPr id="0" name="eda_target_hist.png"/>
+                    <pic:cNvPicPr/>
+                  </pic:nvPicPr>
+                  <pic:blipFill>
+                    <a:blip r:embed="rId12"/>
+                    <a:stretch>
+                      <a:fillRect/>
+                    </a:stretch>
+                  </pic:blipFill>
+                  <pic:spPr>
+                    <a:xfrm>
+                      <a:off x="0" y="0"/>
+                      <a:ext cx="4320000" cy="2160000"/>
+                    </a:xfrm>
+                    <a:prstGeom prst="rect"/>
+                  </pic:spPr>
+                </pic:pic>
+              </a:graphicData>
+            </a:graphic>
+          </wp:inline>
+        </w:drawing>
+      </w:r>
+    </w:p>
+    <w:p>
+      <w:pPr>
+        <w:pStyle w:val="Caption"/>
+        <w:jc w:val="center"/>
+      </w:pPr>
+      <w:r>
+        <w:rPr>
+          <w:rFonts w:ascii="Times New Roman" w:hAnsi="Times New Roman" w:eastAsia="Times New Roman"/>
+          <w:b w:val="0"/>
+          <w:i/>
+          <w:sz w:val="20"/>
+        </w:rPr>
+        <w:t>Figure 4.1: Distribution of primary energy use intensity (kWh/m²/year) after high-rise and geography filtering. The target is right-skewed, motivating robust metrics and residual inspection.</w:t>
+      </w:r>
+    </w:p>
+    <w:p/>
+    <w:p>
+      <w:pPr>
+        <w:jc w:val="center"/>
+      </w:pPr>
+      <w:r>
+        <w:drawing>
+          <wp:inline xmlns:a="http://schemas.openxmlformats.org/drawingml/2006/main" xmlns:pic="http://schemas.openxmlformats.org/drawingml/2006/picture">
+            <wp:extent cx="4320000" cy="2880000"/>
+            <wp:docPr id="3" name="Picture 3"/>
+            <wp:cNvGraphicFramePr>
+              <a:graphicFrameLocks noChangeAspect="1"/>
+            </wp:cNvGraphicFramePr>
+            <a:graphic>
+              <a:graphicData uri="http://schemas.openxmlformats.org/drawingml/2006/picture">
+                <pic:pic>
+                  <pic:nvPicPr>
+                    <pic:cNvPr id="0" name="eda_city_counts.png"/>
+                    <pic:cNvPicPr/>
+                  </pic:nvPicPr>
+                  <pic:blipFill>
+                    <a:blip r:embed="rId13"/>
+                    <a:stretch>
+                      <a:fillRect/>
+                    </a:stretch>
+                  </pic:blipFill>
+                  <pic:spPr>
+                    <a:xfrm>
+                      <a:off x="0" y="0"/>
+                      <a:ext cx="4320000" cy="2880000"/>
+                    </a:xfrm>
+                    <a:prstGeom prst="rect"/>
+                  </pic:spPr>
+                </pic:pic>
+              </a:graphicData>
+            </a:graphic>
+          </wp:inline>
+        </w:drawing>
+      </w:r>
+    </w:p>
+    <w:p>
+      <w:pPr>
+        <w:pStyle w:val="Caption"/>
+        <w:jc w:val="center"/>
+      </w:pPr>
+      <w:r>
+        <w:rPr>
+          <w:rFonts w:ascii="Times New Roman" w:hAnsi="Times New Roman" w:eastAsia="Times New Roman"/>
+          <w:b w:val="0"/>
+          <w:i/>
+          <w:sz w:val="20"/>
+        </w:rPr>
+        <w:t>Figure 4.2: Sample counts by client city. London dominates the federated partition sizes, creating mild quantity skew across clients.</w:t>
+      </w:r>
+    </w:p>
+    <w:p/>
+    <w:p>
+      <w:pPr>
+        <w:jc w:val="center"/>
+      </w:pPr>
+      <w:r>
+        <w:drawing>
+          <wp:inline xmlns:a="http://schemas.openxmlformats.org/drawingml/2006/main" xmlns:pic="http://schemas.openxmlformats.org/drawingml/2006/picture">
+            <wp:extent cx="4320000" cy="2468571"/>
+            <wp:docPr id="4" name="Picture 4"/>
+            <wp:cNvGraphicFramePr>
+              <a:graphicFrameLocks noChangeAspect="1"/>
+            </wp:cNvGraphicFramePr>
+            <a:graphic>
+              <a:graphicData uri="http://schemas.openxmlformats.org/drawingml/2006/picture">
+                <pic:pic>
+                  <pic:nvPicPr>
+                    <pic:cNvPr id="0" name="eda_energy_by_city.png"/>
+                    <pic:cNvPicPr/>
+                  </pic:nvPicPr>
+                  <pic:blipFill>
+                    <a:blip r:embed="rId14"/>
+                    <a:stretch>
+                      <a:fillRect/>
+                    </a:stretch>
+                  </pic:blipFill>
+                  <pic:spPr>
+                    <a:xfrm>
+                      <a:off x="0" y="0"/>
+                      <a:ext cx="4320000" cy="2468571"/>
+                    </a:xfrm>
+                    <a:prstGeom prst="rect"/>
+                  </pic:spPr>
+                </pic:pic>
+              </a:graphicData>
+            </a:graphic>
+          </wp:inline>
+        </w:drawing>
+      </w:r>
+    </w:p>
+    <w:p>
+      <w:pPr>
+        <w:pStyle w:val="Caption"/>
+        <w:jc w:val="center"/>
+      </w:pPr>
+      <w:r>
+        <w:rPr>
+          <w:rFonts w:ascii="Times New Roman" w:hAnsi="Times New Roman" w:eastAsia="Times New Roman"/>
+          <w:b w:val="0"/>
+          <w:i/>
+          <w:sz w:val="20"/>
+        </w:rPr>
+        <w:t>Figure 4.3: Energy distribution by client city (boxplot, non-IID check). Median intensities are broadly similar across London, Manchester, and Birmingham, though outlier profiles differ by city. This mild label heterogeneity validates the geographic partition as a realistic but not adversarial FL testbed.</w:t>
+      </w:r>
+    </w:p>
+    <w:p/>
+    <w:p>
+      <w:pPr>
+        <w:jc w:val="center"/>
+      </w:pPr>
+      <w:r>
+        <w:drawing>
+          <wp:inline xmlns:a="http://schemas.openxmlformats.org/drawingml/2006/main" xmlns:pic="http://schemas.openxmlformats.org/drawingml/2006/picture">
+            <wp:extent cx="4320000" cy="2468571"/>
+            <wp:docPr id="5" name="Picture 5"/>
+            <wp:cNvGraphicFramePr>
+              <a:graphicFrameLocks noChangeAspect="1"/>
+            </wp:cNvGraphicFramePr>
+            <a:graphic>
+              <a:graphicData uri="http://schemas.openxmlformats.org/drawingml/2006/picture">
+                <pic:pic>
+                  <pic:nvPicPr>
+                    <pic:cNvPr id="0" name="eda_area_vs_energy.png"/>
+                    <pic:cNvPicPr/>
+                  </pic:nvPicPr>
+                  <pic:blipFill>
+                    <a:blip r:embed="rId15"/>
+                    <a:stretch>
+                      <a:fillRect/>
+                    </a:stretch>
+                  </pic:blipFill>
+                  <pic:spPr>
+                    <a:xfrm>
+                      <a:off x="0" y="0"/>
+                      <a:ext cx="4320000" cy="2468571"/>
+                    </a:xfrm>
+                    <a:prstGeom prst="rect"/>
+                  </pic:spPr>
+                </pic:pic>
+              </a:graphicData>
+            </a:graphic>
+          </wp:inline>
+        </w:drawing>
+      </w:r>
+    </w:p>
+    <w:p>
+      <w:pPr>
+        <w:pStyle w:val="Caption"/>
+        <w:jc w:val="center"/>
+      </w:pPr>
+      <w:r>
+        <w:rPr>
+          <w:rFonts w:ascii="Times New Roman" w:hAnsi="Times New Roman" w:eastAsia="Times New Roman"/>
+          <w:b w:val="0"/>
+          <w:i/>
+          <w:sz w:val="20"/>
+        </w:rPr>
+        <w:t>Figure 4.4: Floor area versus primary energy intensity. The scatter illustrates cross-sectional variability remaining after fabric and typology encoding.</w:t>
+      </w:r>
+    </w:p>
+    <w:p/>
     <w:p>
       <w:pPr>
         <w:pStyle w:val="Heading2"/>
@@ -5418,9 +5683,239 @@
           <w:sz w:val="24"/>
           <w:szCs w:val="24"/>
         </w:rPr>
-        <w:t xml:space="preserve">The moderate R² values (0.503–0.559) are expected for cross-sectional EPC primary energy prediction without emissions leakage features, occupancy data, or weather normalisation. Early experiments including CO₂ and asset rating fields produced R² &gt; 0.95, confirming target leakage; those features were removed.</w:t>
-      </w:r>
-    </w:p>
+        <w:t xml:space="preserve">The moderate R² values (0.503–0.559) are expected for cross-sectional EPC primary energy prediction without emissions leakage features, occupancy data, or weather normalisation. Early experiments including CO₂ and asset rating fields produced R² &gt; 0.95, confirming target leakage; those features were removed. All evaluation figures shown in this chapter use the held-out 20% test split only; training-set residual plots are excluded to avoid conflating training and generalisation performance.</w:t>
+      </w:r>
+    </w:p>
+    <w:p/>
+    <w:p>
+      <w:pPr>
+        <w:jc w:val="center"/>
+      </w:pPr>
+      <w:r>
+        <w:drawing>
+          <wp:inline xmlns:a="http://schemas.openxmlformats.org/drawingml/2006/main" xmlns:pic="http://schemas.openxmlformats.org/drawingml/2006/picture">
+            <wp:extent cx="4320000" cy="2700000"/>
+            <wp:docPr id="6" name="Picture 6"/>
+            <wp:cNvGraphicFramePr>
+              <a:graphicFrameLocks noChangeAspect="1"/>
+            </wp:cNvGraphicFramePr>
+            <a:graphic>
+              <a:graphicData uri="http://schemas.openxmlformats.org/drawingml/2006/picture">
+                <pic:pic>
+                  <pic:nvPicPr>
+                    <pic:cNvPr id="0" name="baseline_rmse.png"/>
+                    <pic:cNvPicPr/>
+                  </pic:nvPicPr>
+                  <pic:blipFill>
+                    <a:blip r:embed="rId16"/>
+                    <a:stretch>
+                      <a:fillRect/>
+                    </a:stretch>
+                  </pic:blipFill>
+                  <pic:spPr>
+                    <a:xfrm>
+                      <a:off x="0" y="0"/>
+                      <a:ext cx="4320000" cy="2700000"/>
+                    </a:xfrm>
+                    <a:prstGeom prst="rect"/>
+                  </pic:spPr>
+                </pic:pic>
+              </a:graphicData>
+            </a:graphic>
+          </wp:inline>
+        </w:drawing>
+      </w:r>
+    </w:p>
+    <w:p>
+      <w:pPr>
+        <w:pStyle w:val="Caption"/>
+        <w:jc w:val="center"/>
+      </w:pPr>
+      <w:r>
+        <w:rPr>
+          <w:rFonts w:ascii="Times New Roman" w:hAnsi="Times New Roman" w:eastAsia="Times New Roman"/>
+          <w:b w:val="0"/>
+          <w:i/>
+          <w:sz w:val="20"/>
+        </w:rPr>
+        <w:t>Figure 4.5: Centralised baseline RMSE comparison. Gradient Boosting achieves the lowest test RMSE among the evaluated models.</w:t>
+      </w:r>
+    </w:p>
+    <w:p/>
+    <w:p>
+      <w:pPr>
+        <w:jc w:val="center"/>
+      </w:pPr>
+      <w:r>
+        <w:drawing>
+          <wp:inline xmlns:a="http://schemas.openxmlformats.org/drawingml/2006/main" xmlns:pic="http://schemas.openxmlformats.org/drawingml/2006/picture">
+            <wp:extent cx="4320000" cy="2700000"/>
+            <wp:docPr id="7" name="Picture 7"/>
+            <wp:cNvGraphicFramePr>
+              <a:graphicFrameLocks noChangeAspect="1"/>
+            </wp:cNvGraphicFramePr>
+            <a:graphic>
+              <a:graphicData uri="http://schemas.openxmlformats.org/drawingml/2006/picture">
+                <pic:pic>
+                  <pic:nvPicPr>
+                    <pic:cNvPr id="0" name="baseline_r2.png"/>
+                    <pic:cNvPicPr/>
+                  </pic:nvPicPr>
+                  <pic:blipFill>
+                    <a:blip r:embed="rId17"/>
+                    <a:stretch>
+                      <a:fillRect/>
+                    </a:stretch>
+                  </pic:blipFill>
+                  <pic:spPr>
+                    <a:xfrm>
+                      <a:off x="0" y="0"/>
+                      <a:ext cx="4320000" cy="2700000"/>
+                    </a:xfrm>
+                    <a:prstGeom prst="rect"/>
+                  </pic:spPr>
+                </pic:pic>
+              </a:graphicData>
+            </a:graphic>
+          </wp:inline>
+        </w:drawing>
+      </w:r>
+    </w:p>
+    <w:p>
+      <w:pPr>
+        <w:pStyle w:val="Caption"/>
+        <w:jc w:val="center"/>
+      </w:pPr>
+      <w:r>
+        <w:rPr>
+          <w:rFonts w:ascii="Times New Roman" w:hAnsi="Times New Roman" w:eastAsia="Times New Roman"/>
+          <w:b w:val="0"/>
+          <w:i/>
+          <w:sz w:val="20"/>
+        </w:rPr>
+        <w:t>Figure 4.6: Centralised baseline R² comparison. Absolute accuracy remains moderate (R² ≈ 0.50–0.56), consistent with cross-sectional EPC prediction without occupancy or weather features.</w:t>
+      </w:r>
+    </w:p>
+    <w:p/>
+    <w:p>
+      <w:pPr>
+        <w:jc w:val="center"/>
+      </w:pPr>
+      <w:r>
+        <w:drawing>
+          <wp:inline xmlns:a="http://schemas.openxmlformats.org/drawingml/2006/main" xmlns:pic="http://schemas.openxmlformats.org/drawingml/2006/picture">
+            <wp:extent cx="4320000" cy="4320000"/>
+            <wp:docPr id="8" name="Picture 8"/>
+            <wp:cNvGraphicFramePr>
+              <a:graphicFrameLocks noChangeAspect="1"/>
+            </wp:cNvGraphicFramePr>
+            <a:graphic>
+              <a:graphicData uri="http://schemas.openxmlformats.org/drawingml/2006/picture">
+                <pic:pic>
+                  <pic:nvPicPr>
+                    <pic:cNvPr id="0" name="pred_vs_actual_gradient_boosting.png"/>
+                    <pic:cNvPicPr/>
+                  </pic:nvPicPr>
+                  <pic:blipFill>
+                    <a:blip r:embed="rId18"/>
+                    <a:stretch>
+                      <a:fillRect/>
+                    </a:stretch>
+                  </pic:blipFill>
+                  <pic:spPr>
+                    <a:xfrm>
+                      <a:off x="0" y="0"/>
+                      <a:ext cx="4320000" cy="4320000"/>
+                    </a:xfrm>
+                    <a:prstGeom prst="rect"/>
+                  </pic:spPr>
+                </pic:pic>
+              </a:graphicData>
+            </a:graphic>
+          </wp:inline>
+        </w:drawing>
+      </w:r>
+    </w:p>
+    <w:p>
+      <w:pPr>
+        <w:pStyle w:val="Caption"/>
+        <w:jc w:val="center"/>
+      </w:pPr>
+      <w:r>
+        <w:rPr>
+          <w:rFonts w:ascii="Times New Roman" w:hAnsi="Times New Roman" w:eastAsia="Times New Roman"/>
+          <w:b w:val="0"/>
+          <w:i/>
+          <w:sz w:val="20"/>
+        </w:rPr>
+        <w:t>Figure 4.7: Predicted versus actual primary energy intensity for the best centralised model (Gradient Boosting). Absolute errors increase at higher intensities.</w:t>
+      </w:r>
+    </w:p>
+    <w:p>
+      <w:pPr>
+        <w:spacing w:after="80" w:before="0"/>
+      </w:pPr>
+    </w:p>
+    <w:p>
+      <w:pPr>
+        <w:jc w:val="center"/>
+      </w:pPr>
+      <w:r>
+        <w:drawing>
+          <wp:inline xmlns:a="http://schemas.openxmlformats.org/drawingml/2006/main" xmlns:pic="http://schemas.openxmlformats.org/drawingml/2006/picture">
+            <wp:extent cx="4320000" cy="4320000"/>
+            <wp:docPr id="21" name="Picture 21"/>
+            <wp:cNvGraphicFramePr>
+              <a:graphicFrameLocks noChangeAspect="1"/>
+            </wp:cNvGraphicFramePr>
+            <a:graphic>
+              <a:graphicData uri="http://schemas.openxmlformats.org/drawingml/2006/picture">
+                <pic:pic>
+                  <pic:nvPicPr>
+                    <pic:cNvPr id="0" name="pred_vs_actual_mlp.png"/>
+                    <pic:cNvPicPr/>
+                  </pic:nvPicPr>
+                  <pic:blipFill>
+                    <a:blip r:embed="rId21"/>
+                    <a:stretch>
+                      <a:fillRect/>
+                    </a:stretch>
+                  </pic:blipFill>
+                  <pic:spPr>
+                    <a:xfrm>
+                      <a:off x="0" y="0"/>
+                      <a:ext cx="4320000" cy="4320000"/>
+                    </a:xfrm>
+                    <a:prstGeom prst="rect"/>
+                  </pic:spPr>
+                </pic:pic>
+              </a:graphicData>
+            </a:graphic>
+          </wp:inline>
+        </w:drawing>
+      </w:r>
+    </w:p>
+    <w:p>
+      <w:pPr>
+        <w:pStyle w:val="Caption"/>
+        <w:jc w:val="center"/>
+      </w:pPr>
+      <w:r>
+        <w:rPr>
+          <w:rFonts w:ascii="Times New Roman" w:hAnsi="Times New Roman" w:eastAsia="Times New Roman"/>
+          <w:b w:val="0"/>
+          <w:i/>
+          <w:sz w:val="20"/>
+        </w:rPr>
+        <w:t>Figure 4.7b: Predicted versus actual primary energy intensity for the centralised MLP (held-out test set, R² = 0.528). The scatter pattern is consistent with the Gradient Boosting result, confirming both centralised models achieve similar predictive accuracy on this corpus. The MLP serves as the direct comparison baseline for the federated MLP in Section 4.3.</w:t>
+      </w:r>
+    </w:p>
+    <w:p>
+      <w:pPr>
+        <w:spacing w:after="100" w:before="0"/>
+      </w:pPr>
+    </w:p>
+    <w:p/>
     <w:p>
       <w:pPr>
         <w:pStyle w:val="Heading2"/>
@@ -5453,7 +5948,7 @@
           <w:sz w:val="24"/>
           <w:szCs w:val="24"/>
         </w:rPr>
-        <w:t xml:space="preserve">Table 4.3 reports the FedAvg MLP convergence across eight training rounds. The model converges from a negative R² in round 1 (under-initialised global MLP) to R² = 0.517 by round 8 — closely matching the centralised MLP (R² = 0.528).</w:t>
+        <w:t>Table 4.3 reports the FedAvg MLP convergence across eight training rounds. The model converges from a negative R² in round 1 (under-initialised global MLP) to R² = 0.518 by round 8 — closely matching the centralised MLP (R² = 0.528).</w:t>
       </w:r>
     </w:p>
     <w:p>
@@ -5652,7 +6147,7 @@
                 <w:sz w:val="20"/>
                 <w:szCs w:val="20"/>
               </w:rPr>
-              <w:t xml:space="preserve">1</w:t>
+              <w:t>1</w:t>
             </w:r>
           </w:p>
         </w:tc>
@@ -5686,7 +6181,7 @@
                 <w:sz w:val="20"/>
                 <w:szCs w:val="20"/>
               </w:rPr>
-              <w:t xml:space="preserve">206.1</w:t>
+              <w:t>201.51</w:t>
             </w:r>
           </w:p>
         </w:tc>
@@ -5720,7 +6215,7 @@
                 <w:sz w:val="20"/>
                 <w:szCs w:val="20"/>
               </w:rPr>
-              <w:t xml:space="preserve">−0.47</w:t>
+              <w:t>-0.400</w:t>
             </w:r>
           </w:p>
         </w:tc>
@@ -5754,7 +6249,7 @@
                 <w:sz w:val="20"/>
                 <w:szCs w:val="20"/>
               </w:rPr>
-              <w:t xml:space="preserve">Initialisation</w:t>
+              <w:t>Initialisation</w:t>
             </w:r>
           </w:p>
         </w:tc>
@@ -5790,7 +6285,7 @@
                 <w:sz w:val="20"/>
                 <w:szCs w:val="20"/>
               </w:rPr>
-              <w:t xml:space="preserve">2</w:t>
+              <w:t>2</w:t>
             </w:r>
           </w:p>
         </w:tc>
@@ -5824,7 +6319,7 @@
                 <w:sz w:val="20"/>
                 <w:szCs w:val="20"/>
               </w:rPr>
-              <w:t xml:space="preserve">143.8</w:t>
+              <w:t>142.47</w:t>
             </w:r>
           </w:p>
         </w:tc>
@@ -5858,7 +6353,7 @@
                 <w:sz w:val="20"/>
                 <w:szCs w:val="20"/>
               </w:rPr>
-              <w:t xml:space="preserve">0.29</w:t>
+              <w:t>0.300</w:t>
             </w:r>
           </w:p>
         </w:tc>
@@ -5892,7 +6387,7 @@
                 <w:sz w:val="20"/>
                 <w:szCs w:val="20"/>
               </w:rPr>
-              <w:t xml:space="preserve">Rapid gain</w:t>
+              <w:t>Rapid gain</w:t>
             </w:r>
           </w:p>
         </w:tc>
@@ -5928,7 +6423,7 @@
                 <w:sz w:val="20"/>
                 <w:szCs w:val="20"/>
               </w:rPr>
-              <w:t xml:space="preserve">3</w:t>
+              <w:t>3</w:t>
             </w:r>
           </w:p>
         </w:tc>
@@ -5962,7 +6457,7 @@
                 <w:sz w:val="20"/>
                 <w:szCs w:val="20"/>
               </w:rPr>
-              <w:t xml:space="preserve">129.6</w:t>
+              <w:t>128.19</w:t>
             </w:r>
           </w:p>
         </w:tc>
@@ -5996,7 +6491,7 @@
                 <w:sz w:val="20"/>
                 <w:szCs w:val="20"/>
               </w:rPr>
-              <w:t xml:space="preserve">0.42</w:t>
+              <w:t>0.433</w:t>
             </w:r>
           </w:p>
         </w:tc>
@@ -6030,7 +6525,7 @@
                 <w:sz w:val="20"/>
                 <w:szCs w:val="20"/>
               </w:rPr>
-              <w:t xml:space="preserve">Rapid gain</w:t>
+              <w:t>Rapid gain</w:t>
             </w:r>
           </w:p>
         </w:tc>
@@ -6066,7 +6561,7 @@
                 <w:sz w:val="20"/>
                 <w:szCs w:val="20"/>
               </w:rPr>
-              <w:t xml:space="preserve">4</w:t>
+              <w:t>4</w:t>
             </w:r>
           </w:p>
         </w:tc>
@@ -6100,7 +6595,7 @@
                 <w:sz w:val="20"/>
                 <w:szCs w:val="20"/>
               </w:rPr>
-              <w:t xml:space="preserve">122.6</w:t>
+              <w:t>121.67</w:t>
             </w:r>
           </w:p>
         </w:tc>
@@ -6134,7 +6629,7 @@
                 <w:sz w:val="20"/>
                 <w:szCs w:val="20"/>
               </w:rPr>
-              <w:t xml:space="preserve">0.48</w:t>
+              <w:t>0.490</w:t>
             </w:r>
           </w:p>
         </w:tc>
@@ -6168,7 +6663,7 @@
                 <w:sz w:val="20"/>
                 <w:szCs w:val="20"/>
               </w:rPr>
-              <w:t xml:space="preserve">Stabilising</w:t>
+              <w:t>Stabilising</w:t>
             </w:r>
           </w:p>
         </w:tc>
@@ -6204,7 +6699,7 @@
                 <w:sz w:val="20"/>
                 <w:szCs w:val="20"/>
               </w:rPr>
-              <w:t xml:space="preserve">5</w:t>
+              <w:t>5</w:t>
             </w:r>
           </w:p>
         </w:tc>
@@ -6238,7 +6733,7 @@
                 <w:sz w:val="20"/>
                 <w:szCs w:val="20"/>
               </w:rPr>
-              <w:t xml:space="preserve">119.8</w:t>
+              <w:t>119.21</w:t>
             </w:r>
           </w:p>
         </w:tc>
@@ -6272,7 +6767,7 @@
                 <w:sz w:val="20"/>
                 <w:szCs w:val="20"/>
               </w:rPr>
-              <w:t xml:space="preserve">0.51</w:t>
+              <w:t>0.510</w:t>
             </w:r>
           </w:p>
         </w:tc>
@@ -6306,7 +6801,7 @@
                 <w:sz w:val="20"/>
                 <w:szCs w:val="20"/>
               </w:rPr>
-              <w:t xml:space="preserve">Stabilising</w:t>
+              <w:t>Stabilising</w:t>
             </w:r>
           </w:p>
         </w:tc>
@@ -6342,7 +6837,7 @@
                 <w:sz w:val="20"/>
                 <w:szCs w:val="20"/>
               </w:rPr>
-              <w:t xml:space="preserve">6</w:t>
+              <w:t>6</w:t>
             </w:r>
           </w:p>
         </w:tc>
@@ -6376,7 +6871,7 @@
                 <w:sz w:val="20"/>
                 <w:szCs w:val="20"/>
               </w:rPr>
-              <w:t xml:space="preserve">119.2</w:t>
+              <w:t>118.57</w:t>
             </w:r>
           </w:p>
         </w:tc>
@@ -6410,7 +6905,7 @@
                 <w:sz w:val="20"/>
                 <w:szCs w:val="20"/>
               </w:rPr>
-              <w:t xml:space="preserve">0.51</w:t>
+              <w:t>0.515</w:t>
             </w:r>
           </w:p>
         </w:tc>
@@ -6444,7 +6939,7 @@
                 <w:sz w:val="20"/>
                 <w:szCs w:val="20"/>
               </w:rPr>
-              <w:t xml:space="preserve">Converged</w:t>
+              <w:t>Converged</w:t>
             </w:r>
           </w:p>
         </w:tc>
@@ -6480,7 +6975,7 @@
                 <w:sz w:val="20"/>
                 <w:szCs w:val="20"/>
               </w:rPr>
-              <w:t xml:space="preserve">7</w:t>
+              <w:t>7</w:t>
             </w:r>
           </w:p>
         </w:tc>
@@ -6514,7 +7009,7 @@
                 <w:sz w:val="20"/>
                 <w:szCs w:val="20"/>
               </w:rPr>
-              <w:t xml:space="preserve">118.7</w:t>
+              <w:t>118.38</w:t>
             </w:r>
           </w:p>
         </w:tc>
@@ -6548,7 +7043,7 @@
                 <w:sz w:val="20"/>
                 <w:szCs w:val="20"/>
               </w:rPr>
-              <w:t xml:space="preserve">0.51</w:t>
+              <w:t>0.517</w:t>
             </w:r>
           </w:p>
         </w:tc>
@@ -6582,7 +7077,7 @@
                 <w:sz w:val="20"/>
                 <w:szCs w:val="20"/>
               </w:rPr>
-              <w:t xml:space="preserve">Converged</w:t>
+              <w:t>Converged</w:t>
             </w:r>
           </w:p>
         </w:tc>
@@ -6618,7 +7113,7 @@
                 <w:sz w:val="20"/>
                 <w:szCs w:val="20"/>
               </w:rPr>
-              <w:t xml:space="preserve">8</w:t>
+              <w:t>8</w:t>
             </w:r>
           </w:p>
         </w:tc>
@@ -6652,7 +7147,7 @@
                 <w:sz w:val="20"/>
                 <w:szCs w:val="20"/>
               </w:rPr>
-              <w:t xml:space="preserve">118.32</w:t>
+              <w:t>118.21</w:t>
             </w:r>
           </w:p>
         </w:tc>
@@ -6686,7 +7181,7 @@
                 <w:sz w:val="20"/>
                 <w:szCs w:val="20"/>
               </w:rPr>
-              <w:t xml:space="preserve">0.517</w:t>
+              <w:t>0.518</w:t>
             </w:r>
           </w:p>
         </w:tc>
@@ -6720,7 +7215,7 @@
                 <w:sz w:val="20"/>
                 <w:szCs w:val="20"/>
               </w:rPr>
-              <w:t xml:space="preserve">Final</w:t>
+              <w:t>Final</w:t>
             </w:r>
           </w:p>
         </w:tc>
@@ -6764,9 +7259,222 @@
           <w:sz w:val="24"/>
           <w:szCs w:val="24"/>
         </w:rPr>
-        <w:t xml:space="preserve">Final federated metrics: RMSE = 118.32, MAE = 84.92, R² = 0.517, MAPE = 49.57%. The federated MLP nearly matches the centralised MLP (R² 0.528) and trails the best tree model (Gradient Boosting, R² 0.559) by a modest margin. Answer to RQ1: Yes — FedAvg can approach centralised neural performance on this geographic split without pooling raw client data during training.</w:t>
-      </w:r>
-    </w:p>
+        <w:t>Final federated metrics: RMSE = 118.21, MAE = 84.81, R² = 0.518, MAPE = 49.45%. The federated MLP nearly matches the centralised MLP (R² 0.528) and trails the best tree model (Gradient Boosting, R² 0.559) by a modest margin. Answer to RQ1: Yes — FedAvg can approach centralised neural performance on this geographic split without pooling raw client data during training.</w:t>
+      </w:r>
+    </w:p>
+    <w:p>
+      <w:pPr>
+        <w:spacing w:after="160" w:before="0" w:line="360" w:lineRule="auto"/>
+        <w:jc w:val="both"/>
+      </w:pPr>
+      <w:r>
+        <w:rPr>
+          <w:rFonts w:ascii="Times New Roman" w:cs="Times New Roman" w:eastAsia="Times New Roman" w:hAnsi="Times New Roman"/>
+          <w:b w:val="false"/>
+          <w:bCs w:val="false"/>
+          <w:caps w:val="false"/>
+          <w:color w:val="000000"/>
+          <w:sz w:val="24"/>
+          <w:szCs w:val="24"/>
+        </w:rPr>
+        <w:t xml:space="preserve">FedProx (Li et al., 2020) with proximal regularisation term μ = 0.01 was also evaluated. As visible in Figure 4.8, FedProx converges slightly faster than FedAvg in rounds 2–4, reflecting its proximal term moderating client drift under the mild geographic label heterogeneity. By round 6 both strategies reach equivalent test RMSE (approximately 119), and final round 8 performance is effectively identical. This convergence parity under mild non-IID conditions is expected: FedProx advantage is most pronounced under strong distributional skew, which the three-city partition does not fully exhibit. The result nonetheless confirms that FedProx offers a practically zero-cost robustness mechanism for the EPC federated setting.</w:t>
+      </w:r>
+    </w:p>
+    <w:p/>
+    <w:p>
+      <w:pPr>
+        <w:jc w:val="center"/>
+      </w:pPr>
+      <w:r>
+        <w:drawing>
+          <wp:inline xmlns:a="http://schemas.openxmlformats.org/drawingml/2006/main" xmlns:pic="http://schemas.openxmlformats.org/drawingml/2006/picture">
+            <wp:extent cx="4680000" cy="2632500"/>
+            <wp:docPr id="9" name="Picture 9"/>
+            <wp:cNvGraphicFramePr>
+              <a:graphicFrameLocks noChangeAspect="1"/>
+            </wp:cNvGraphicFramePr>
+            <a:graphic>
+              <a:graphicData uri="http://schemas.openxmlformats.org/drawingml/2006/picture">
+                <pic:pic>
+                  <pic:nvPicPr>
+                    <pic:cNvPr id="0" name="federated_convergence.png"/>
+                    <pic:cNvPicPr/>
+                  </pic:nvPicPr>
+                  <pic:blipFill>
+                    <a:blip r:embed="rId19"/>
+                    <a:stretch>
+                      <a:fillRect/>
+                    </a:stretch>
+                  </pic:blipFill>
+                  <pic:spPr>
+                    <a:xfrm>
+                      <a:off x="0" y="0"/>
+                      <a:ext cx="4680000" cy="2632500"/>
+                    </a:xfrm>
+                    <a:prstGeom prst="rect"/>
+                  </pic:spPr>
+                </pic:pic>
+              </a:graphicData>
+            </a:graphic>
+          </wp:inline>
+        </w:drawing>
+      </w:r>
+    </w:p>
+    <w:p>
+      <w:pPr>
+        <w:pStyle w:val="Caption"/>
+        <w:jc w:val="center"/>
+      </w:pPr>
+      <w:r>
+        <w:rPr>
+          <w:rFonts w:ascii="Times New Roman" w:hAnsi="Times New Roman" w:eastAsia="Times New Roman"/>
+          <w:b w:val="0"/>
+          <w:i/>
+          <w:sz w:val="20"/>
+        </w:rPr>
+        <w:t>Figure 4.8: Federated learning convergence — FedAvg vs FedProx (μ = 0.01). Both strategies converge to equivalent final RMSE (~118) after eight rounds. FedProx converges marginally faster in rounds 2–4, consistent with its proximal regularisation reducing early client drift under the geographic non-IID partition.</w:t>
+      </w:r>
+    </w:p>
+    <w:p/>
+    <w:p>
+      <w:pPr>
+        <w:jc w:val="center"/>
+      </w:pPr>
+      <w:r>
+        <w:drawing>
+          <wp:inline xmlns:a="http://schemas.openxmlformats.org/drawingml/2006/main" xmlns:pic="http://schemas.openxmlformats.org/drawingml/2006/picture">
+            <wp:extent cx="4320000" cy="4320000"/>
+            <wp:docPr id="10" name="Picture 10"/>
+            <wp:cNvGraphicFramePr>
+              <a:graphicFrameLocks noChangeAspect="1"/>
+            </wp:cNvGraphicFramePr>
+            <a:graphic>
+              <a:graphicData uri="http://schemas.openxmlformats.org/drawingml/2006/picture">
+                <pic:pic>
+                  <pic:nvPicPr>
+                    <pic:cNvPr id="0" name="pred_vs_actual_federated.png"/>
+                    <pic:cNvPicPr/>
+                  </pic:nvPicPr>
+                  <pic:blipFill>
+                    <a:blip r:embed="rId20"/>
+                    <a:stretch>
+                      <a:fillRect/>
+                    </a:stretch>
+                  </pic:blipFill>
+                  <pic:spPr>
+                    <a:xfrm>
+                      <a:off x="0" y="0"/>
+                      <a:ext cx="4320000" cy="4320000"/>
+                    </a:xfrm>
+                    <a:prstGeom prst="rect"/>
+                  </pic:spPr>
+                </pic:pic>
+              </a:graphicData>
+            </a:graphic>
+          </wp:inline>
+        </w:drawing>
+      </w:r>
+    </w:p>
+    <w:p>
+      <w:pPr>
+        <w:pStyle w:val="Caption"/>
+        <w:jc w:val="center"/>
+      </w:pPr>
+      <w:r>
+        <w:rPr>
+          <w:rFonts w:ascii="Times New Roman" w:hAnsi="Times New Roman" w:eastAsia="Times New Roman"/>
+          <w:b w:val="0"/>
+          <w:i/>
+          <w:sz w:val="20"/>
+        </w:rPr>
+        <w:t>Figure 4.9: Predicted versus actual primary energy intensity for the federated MLP. Residual magnitude pattern is similar to the centralised tree model, with slightly higher MAE.</w:t>
+      </w:r>
+    </w:p>
+    <w:p/>
+    <w:p>
+      <w:pPr>
+        <w:pStyle w:val="Heading3"/>
+      </w:pPr>
+      <w:r>
+        <w:rPr>
+          <w:rFonts w:ascii="Times New Roman" w:hAnsi="Times New Roman"/>
+          <w:sz w:val="22"/>
+        </w:rPr>
+        <w:t>4.3.1 Extended Federated Convergence (20 rounds)</w:t>
+      </w:r>
+    </w:p>
+    <w:p>
+      <w:r>
+        <w:rPr>
+          <w:rFonts w:ascii="Times New Roman" w:hAnsi="Times New Roman"/>
+          <w:sz w:val="22"/>
+        </w:rPr>
+        <w:t>To assess whether the eight-round schedule understates attainable federated performance, FedAvg and FedProx (μ = 0.01) were extended to 20 rounds under the same architecture and local-epoch settings (scripts/run_federated_20rounds.py). This extension is an independent longer-horizon run — not a continuation of the Table 4.3 checkpoint — so Round-8 RMSE differs slightly (117.80 versus 118.21 in Table 4.3). FedAvg improved from RMSE 117.80 at round 8 of that run to 116.23 at round 20 (final R² = 0.534). FedProx reached RMSE 115.48 (final R² = 0.540), slightly outperforming FedAvg at the longer horizon. Both strategies were already within 5% of the centralised MLP RMSE by round 4. Figure 4.10 shows the 20-round trajectories with centralised MLP and Gradient Boosting RMSE reference lines. Primary RQ1 numbers remain the eight-round artefacts in Table 4.3.</w:t>
+      </w:r>
+    </w:p>
+    <w:p>
+      <w:r>
+        <w:rPr>
+          <w:rFonts w:ascii="Times New Roman" w:hAnsi="Times New Roman"/>
+          <w:sz w:val="22"/>
+        </w:rPr>
+        <w:t>Checkpoint comparison from the independent 20-round run (Test RMSE): FedAvg — R8 117.80, R12 117.19, R16 116.51, R20 116.23; FedProx — R8 118.12, R12 117.15, R16 116.30, R20 115.48 (results/tables/fl_strategy_comparison.csv).</w:t>
+      </w:r>
+    </w:p>
+    <w:p/>
+    <w:p>
+      <w:pPr>
+        <w:jc w:val="center"/>
+      </w:pPr>
+      <w:r>
+        <w:drawing>
+          <wp:inline xmlns:a="http://schemas.openxmlformats.org/drawingml/2006/main" xmlns:pic="http://schemas.openxmlformats.org/drawingml/2006/picture">
+            <wp:extent cx="5220000" cy="2900000"/>
+            <wp:docPr id="22" name="Picture 22"/>
+            <wp:cNvGraphicFramePr>
+              <a:graphicFrameLocks noChangeAspect="1"/>
+            </wp:cNvGraphicFramePr>
+            <a:graphic>
+              <a:graphicData uri="http://schemas.openxmlformats.org/drawingml/2006/picture">
+                <pic:pic>
+                  <pic:nvPicPr>
+                    <pic:cNvPr id="0" name="federated_convergence_20rounds.png"/>
+                    <pic:cNvPicPr/>
+                  </pic:nvPicPr>
+                  <pic:blipFill>
+                    <a:blip r:embed="rId22"/>
+                    <a:stretch>
+                      <a:fillRect/>
+                    </a:stretch>
+                  </pic:blipFill>
+                  <pic:spPr>
+                    <a:xfrm>
+                      <a:off x="0" y="0"/>
+                      <a:ext cx="5220000" cy="2900000"/>
+                    </a:xfrm>
+                    <a:prstGeom prst="rect"/>
+                  </pic:spPr>
+                </pic:pic>
+              </a:graphicData>
+            </a:graphic>
+          </wp:inline>
+        </w:drawing>
+      </w:r>
+    </w:p>
+    <w:p>
+      <w:pPr>
+        <w:pStyle w:val="Caption"/>
+        <w:jc w:val="center"/>
+      </w:pPr>
+      <w:r>
+        <w:rPr>
+          <w:i/>
+          <w:sz w:val="20"/>
+        </w:rPr>
+        <w:t>Figure 4.10: Federated convergence over 20 rounds (FedAvg vs FedProx) with centralised MLP and Gradient Boosting RMSE reference lines.</w:t>
+      </w:r>
+    </w:p>
+    <w:p/>
     <w:p>
       <w:pPr>
         <w:pStyle w:val="Heading2"/>
@@ -7032,7 +7740,7 @@
                 <w:sz w:val="20"/>
                 <w:szCs w:val="20"/>
               </w:rPr>
-              <w:t xml:space="preserve">W = 213,847</w:t>
+              <w:t>W = 262,557.5</w:t>
             </w:r>
           </w:p>
         </w:tc>
@@ -7066,7 +7774,7 @@
                 <w:sz w:val="20"/>
                 <w:szCs w:val="20"/>
               </w:rPr>
-              <w:t xml:space="preserve">1.06 × 10⁻⁵</w:t>
+              <w:t>1.85e-05</w:t>
             </w:r>
           </w:p>
         </w:tc>
@@ -7100,7 +7808,7 @@
                 <w:sz w:val="20"/>
                 <w:szCs w:val="20"/>
               </w:rPr>
-              <w:t xml:space="preserve">Significant</w:t>
+              <w:t>Significant</w:t>
             </w:r>
           </w:p>
         </w:tc>
@@ -7170,7 +7878,7 @@
                 <w:sz w:val="20"/>
                 <w:szCs w:val="20"/>
               </w:rPr>
-              <w:t xml:space="preserve">t = 4.31</w:t>
+              <w:t>t = -3.96</w:t>
             </w:r>
           </w:p>
         </w:tc>
@@ -7204,7 +7912,7 @@
                 <w:sz w:val="20"/>
                 <w:szCs w:val="20"/>
               </w:rPr>
-              <w:t xml:space="preserve">4.98 × 10⁻⁵</w:t>
+              <w:t>7.97e-05</w:t>
             </w:r>
           </w:p>
         </w:tc>
@@ -7238,7 +7946,7 @@
                 <w:sz w:val="20"/>
                 <w:szCs w:val="20"/>
               </w:rPr>
-              <w:t xml:space="preserve">Significant</w:t>
+              <w:t>Significant</w:t>
             </w:r>
           </w:p>
         </w:tc>
@@ -7308,7 +8016,7 @@
                 <w:sz w:val="20"/>
                 <w:szCs w:val="20"/>
               </w:rPr>
-              <w:t xml:space="preserve">80.02 vs 84.92</w:t>
+              <w:t>80.02 vs 84.81</w:t>
             </w:r>
           </w:p>
         </w:tc>
@@ -7342,7 +8050,7 @@
                 <w:sz w:val="20"/>
                 <w:szCs w:val="20"/>
               </w:rPr>
-              <w:t xml:space="preserve">Δ = 4.90 kWh/m²/yr</w:t>
+              <w:t>Δ = 4.79 kWh/m²/yr</w:t>
             </w:r>
           </w:p>
         </w:tc>
@@ -7376,7 +8084,421 @@
                 <w:sz w:val="20"/>
                 <w:szCs w:val="20"/>
               </w:rPr>
-              <w:t xml:space="preserve">Practically modest</w:t>
+              <w:t>Practically modest</w:t>
+            </w:r>
+          </w:p>
+        </w:tc>
+      </w:tr>
+      <w:tr>
+        <w:tc>
+          <w:tcPr>
+            <w:tcW w:type="dxa" w:w="2800"/>
+            <w:tcBorders>
+              <w:top w:val="single" w:color="000000" w:sz="6"/>
+              <w:left w:val="single" w:color="000000" w:sz="6"/>
+              <w:bottom w:val="single" w:color="000000" w:sz="6"/>
+              <w:right w:val="single" w:color="000000" w:sz="6"/>
+            </w:tcBorders>
+            <w:tcMar>
+              <w:top w:type="dxa" w:w="80"/>
+              <w:left w:type="dxa" w:w="120"/>
+              <w:bottom w:type="dxa" w:w="80"/>
+              <w:right w:type="dxa" w:w="120"/>
+            </w:tcMar>
+            <w:vAlign w:val="center"/>
+          </w:tcPr>
+          <w:p>
+            <w:pPr>
+              <w:spacing w:after="0" w:before="0"/>
+              <w:jc w:val="left"/>
+            </w:pPr>
+            <w:r>
+              <w:rPr>
+                <w:rFonts w:ascii="Times New Roman" w:cs="Times New Roman" w:eastAsia="Times New Roman" w:hAnsi="Times New Roman"/>
+                <w:b w:val="false"/>
+                <w:bCs w:val="false"/>
+                <w:sz w:val="20"/>
+                <w:szCs w:val="20"/>
+              </w:rPr>
+              <w:t>GB RMSE 95% CI (bootstrap)</w:t>
+            </w:r>
+          </w:p>
+        </w:tc>
+        <w:tc>
+          <w:tcPr>
+            <w:tcW w:type="dxa" w:w="2280"/>
+            <w:tcBorders>
+              <w:top w:val="single" w:color="000000" w:sz="6"/>
+              <w:left w:val="single" w:color="000000" w:sz="6"/>
+              <w:bottom w:val="single" w:color="000000" w:sz="6"/>
+              <w:right w:val="single" w:color="000000" w:sz="6"/>
+            </w:tcBorders>
+            <w:tcMar>
+              <w:top w:type="dxa" w:w="80"/>
+              <w:left w:type="dxa" w:w="120"/>
+              <w:bottom w:type="dxa" w:w="80"/>
+              <w:right w:type="dxa" w:w="120"/>
+            </w:tcMar>
+            <w:vAlign w:val="center"/>
+          </w:tcPr>
+          <w:p>
+            <w:pPr>
+              <w:spacing w:after="0" w:before="0"/>
+              <w:jc w:val="center"/>
+            </w:pPr>
+            <w:r>
+              <w:rPr>
+                <w:rFonts w:ascii="Times New Roman" w:cs="Times New Roman" w:eastAsia="Times New Roman" w:hAnsi="Times New Roman"/>
+                <w:b w:val="false"/>
+                <w:bCs w:val="false"/>
+                <w:sz w:val="20"/>
+                <w:szCs w:val="20"/>
+              </w:rPr>
+              <w:t>113.04</w:t>
+            </w:r>
+          </w:p>
+        </w:tc>
+        <w:tc>
+          <w:tcPr>
+            <w:tcW w:type="dxa" w:w="2280"/>
+            <w:tcBorders>
+              <w:top w:val="single" w:color="000000" w:sz="6"/>
+              <w:left w:val="single" w:color="000000" w:sz="6"/>
+              <w:bottom w:val="single" w:color="000000" w:sz="6"/>
+              <w:right w:val="single" w:color="000000" w:sz="6"/>
+            </w:tcBorders>
+            <w:tcMar>
+              <w:top w:type="dxa" w:w="80"/>
+              <w:left w:type="dxa" w:w="120"/>
+              <w:bottom w:type="dxa" w:w="80"/>
+              <w:right w:type="dxa" w:w="120"/>
+            </w:tcMar>
+            <w:vAlign w:val="center"/>
+          </w:tcPr>
+          <w:p>
+            <w:pPr>
+              <w:spacing w:after="0" w:before="0"/>
+              <w:jc w:val="center"/>
+            </w:pPr>
+            <w:r>
+              <w:rPr>
+                <w:rFonts w:ascii="Times New Roman" w:cs="Times New Roman" w:eastAsia="Times New Roman" w:hAnsi="Times New Roman"/>
+                <w:b w:val="false"/>
+                <w:bCs w:val="false"/>
+                <w:sz w:val="20"/>
+                <w:szCs w:val="20"/>
+              </w:rPr>
+              <w:t>[105.94 – 120.08]</w:t>
+            </w:r>
+          </w:p>
+        </w:tc>
+        <w:tc>
+          <w:tcPr>
+            <w:tcW w:type="dxa" w:w="2000"/>
+            <w:tcBorders>
+              <w:top w:val="single" w:color="000000" w:sz="6"/>
+              <w:left w:val="single" w:color="000000" w:sz="6"/>
+              <w:bottom w:val="single" w:color="000000" w:sz="6"/>
+              <w:right w:val="single" w:color="000000" w:sz="6"/>
+            </w:tcBorders>
+            <w:tcMar>
+              <w:top w:type="dxa" w:w="80"/>
+              <w:left w:type="dxa" w:w="120"/>
+              <w:bottom w:type="dxa" w:w="80"/>
+              <w:right w:type="dxa" w:w="120"/>
+            </w:tcMar>
+            <w:vAlign w:val="center"/>
+          </w:tcPr>
+          <w:p>
+            <w:pPr>
+              <w:spacing w:after="0" w:before="0"/>
+              <w:jc w:val="center"/>
+            </w:pPr>
+            <w:r>
+              <w:rPr>
+                <w:rFonts w:ascii="Times New Roman" w:cs="Times New Roman" w:eastAsia="Times New Roman" w:hAnsi="Times New Roman"/>
+                <w:b w:val="false"/>
+                <w:bCs w:val="false"/>
+                <w:sz w:val="20"/>
+                <w:szCs w:val="20"/>
+              </w:rPr>
+              <w:t>n=2000 resamples</w:t>
+            </w:r>
+          </w:p>
+        </w:tc>
+      </w:tr>
+      <w:tr>
+        <w:tc>
+          <w:tcPr>
+            <w:tcW w:type="dxa" w:w="2800"/>
+            <w:tcBorders>
+              <w:top w:val="single" w:color="000000" w:sz="6"/>
+              <w:left w:val="single" w:color="000000" w:sz="6"/>
+              <w:bottom w:val="single" w:color="000000" w:sz="6"/>
+              <w:right w:val="single" w:color="000000" w:sz="6"/>
+            </w:tcBorders>
+            <w:tcMar>
+              <w:top w:type="dxa" w:w="80"/>
+              <w:left w:type="dxa" w:w="120"/>
+              <w:bottom w:type="dxa" w:w="80"/>
+              <w:right w:type="dxa" w:w="120"/>
+            </w:tcMar>
+            <w:vAlign w:val="center"/>
+          </w:tcPr>
+          <w:p>
+            <w:pPr>
+              <w:spacing w:after="0" w:before="0"/>
+              <w:jc w:val="left"/>
+            </w:pPr>
+            <w:r>
+              <w:rPr>
+                <w:rFonts w:ascii="Times New Roman" w:cs="Times New Roman" w:eastAsia="Times New Roman" w:hAnsi="Times New Roman"/>
+                <w:b w:val="false"/>
+                <w:bCs w:val="false"/>
+                <w:sz w:val="20"/>
+                <w:szCs w:val="20"/>
+              </w:rPr>
+              <w:t>Federated RMSE 95% CI (bootstrap)</w:t>
+            </w:r>
+          </w:p>
+        </w:tc>
+        <w:tc>
+          <w:tcPr>
+            <w:tcW w:type="dxa" w:w="2280"/>
+            <w:tcBorders>
+              <w:top w:val="single" w:color="000000" w:sz="6"/>
+              <w:left w:val="single" w:color="000000" w:sz="6"/>
+              <w:bottom w:val="single" w:color="000000" w:sz="6"/>
+              <w:right w:val="single" w:color="000000" w:sz="6"/>
+            </w:tcBorders>
+            <w:tcMar>
+              <w:top w:type="dxa" w:w="80"/>
+              <w:left w:type="dxa" w:w="120"/>
+              <w:bottom w:type="dxa" w:w="80"/>
+              <w:right w:type="dxa" w:w="120"/>
+            </w:tcMar>
+            <w:vAlign w:val="center"/>
+          </w:tcPr>
+          <w:p>
+            <w:pPr>
+              <w:spacing w:after="0" w:before="0"/>
+              <w:jc w:val="center"/>
+            </w:pPr>
+            <w:r>
+              <w:rPr>
+                <w:rFonts w:ascii="Times New Roman" w:cs="Times New Roman" w:eastAsia="Times New Roman" w:hAnsi="Times New Roman"/>
+                <w:b w:val="false"/>
+                <w:bCs w:val="false"/>
+                <w:sz w:val="20"/>
+                <w:szCs w:val="20"/>
+              </w:rPr>
+              <w:t>118.21</w:t>
+            </w:r>
+          </w:p>
+        </w:tc>
+        <w:tc>
+          <w:tcPr>
+            <w:tcW w:type="dxa" w:w="2280"/>
+            <w:tcBorders>
+              <w:top w:val="single" w:color="000000" w:sz="6"/>
+              <w:left w:val="single" w:color="000000" w:sz="6"/>
+              <w:bottom w:val="single" w:color="000000" w:sz="6"/>
+              <w:right w:val="single" w:color="000000" w:sz="6"/>
+            </w:tcBorders>
+            <w:tcMar>
+              <w:top w:type="dxa" w:w="80"/>
+              <w:left w:type="dxa" w:w="120"/>
+              <w:bottom w:type="dxa" w:w="80"/>
+              <w:right w:type="dxa" w:w="120"/>
+            </w:tcMar>
+            <w:vAlign w:val="center"/>
+          </w:tcPr>
+          <w:p>
+            <w:pPr>
+              <w:spacing w:after="0" w:before="0"/>
+              <w:jc w:val="center"/>
+            </w:pPr>
+            <w:r>
+              <w:rPr>
+                <w:rFonts w:ascii="Times New Roman" w:cs="Times New Roman" w:eastAsia="Times New Roman" w:hAnsi="Times New Roman"/>
+                <w:b w:val="false"/>
+                <w:bCs w:val="false"/>
+                <w:sz w:val="20"/>
+                <w:szCs w:val="20"/>
+              </w:rPr>
+              <w:t>[110.81 – 125.43]</w:t>
+            </w:r>
+          </w:p>
+        </w:tc>
+        <w:tc>
+          <w:tcPr>
+            <w:tcW w:type="dxa" w:w="2000"/>
+            <w:tcBorders>
+              <w:top w:val="single" w:color="000000" w:sz="6"/>
+              <w:left w:val="single" w:color="000000" w:sz="6"/>
+              <w:bottom w:val="single" w:color="000000" w:sz="6"/>
+              <w:right w:val="single" w:color="000000" w:sz="6"/>
+            </w:tcBorders>
+            <w:tcMar>
+              <w:top w:type="dxa" w:w="80"/>
+              <w:left w:type="dxa" w:w="120"/>
+              <w:bottom w:type="dxa" w:w="80"/>
+              <w:right w:type="dxa" w:w="120"/>
+            </w:tcMar>
+            <w:vAlign w:val="center"/>
+          </w:tcPr>
+          <w:p>
+            <w:pPr>
+              <w:spacing w:after="0" w:before="0"/>
+              <w:jc w:val="center"/>
+            </w:pPr>
+            <w:r>
+              <w:rPr>
+                <w:rFonts w:ascii="Times New Roman" w:cs="Times New Roman" w:eastAsia="Times New Roman" w:hAnsi="Times New Roman"/>
+                <w:b w:val="false"/>
+                <w:bCs w:val="false"/>
+                <w:sz w:val="20"/>
+                <w:szCs w:val="20"/>
+              </w:rPr>
+              <w:t>CIs overlap: YES</w:t>
+            </w:r>
+          </w:p>
+        </w:tc>
+      </w:tr>
+      <w:tr>
+        <w:tc>
+          <w:tcPr>
+            <w:tcW w:type="dxa" w:w="2800"/>
+            <w:tcBorders>
+              <w:top w:val="single" w:color="000000" w:sz="6"/>
+              <w:left w:val="single" w:color="000000" w:sz="6"/>
+              <w:bottom w:val="single" w:color="000000" w:sz="6"/>
+              <w:right w:val="single" w:color="000000" w:sz="6"/>
+            </w:tcBorders>
+            <w:tcMar>
+              <w:top w:type="dxa" w:w="80"/>
+              <w:left w:type="dxa" w:w="120"/>
+              <w:bottom w:type="dxa" w:w="80"/>
+              <w:right w:type="dxa" w:w="120"/>
+            </w:tcMar>
+            <w:vAlign w:val="center"/>
+          </w:tcPr>
+          <w:p>
+            <w:pPr>
+              <w:spacing w:after="0" w:before="0"/>
+              <w:jc w:val="left"/>
+            </w:pPr>
+            <w:r>
+              <w:rPr>
+                <w:rFonts w:ascii="Times New Roman" w:cs="Times New Roman" w:eastAsia="Times New Roman" w:hAnsi="Times New Roman"/>
+                <w:b w:val="false"/>
+                <w:bCs w:val="false"/>
+                <w:sz w:val="20"/>
+                <w:szCs w:val="20"/>
+              </w:rPr>
+              <w:t>Cohen's d (abs. errors)</w:t>
+            </w:r>
+          </w:p>
+        </w:tc>
+        <w:tc>
+          <w:tcPr>
+            <w:tcW w:type="dxa" w:w="2280"/>
+            <w:tcBorders>
+              <w:top w:val="single" w:color="000000" w:sz="6"/>
+              <w:left w:val="single" w:color="000000" w:sz="6"/>
+              <w:bottom w:val="single" w:color="000000" w:sz="6"/>
+              <w:right w:val="single" w:color="000000" w:sz="6"/>
+            </w:tcBorders>
+            <w:tcMar>
+              <w:top w:type="dxa" w:w="80"/>
+              <w:left w:type="dxa" w:w="120"/>
+              <w:bottom w:type="dxa" w:w="80"/>
+              <w:right w:type="dxa" w:w="120"/>
+            </w:tcMar>
+            <w:vAlign w:val="center"/>
+          </w:tcPr>
+          <w:p>
+            <w:pPr>
+              <w:spacing w:after="0" w:before="0"/>
+              <w:jc w:val="center"/>
+            </w:pPr>
+            <w:r>
+              <w:rPr>
+                <w:rFonts w:ascii="Times New Roman" w:cs="Times New Roman" w:eastAsia="Times New Roman" w:hAnsi="Times New Roman"/>
+                <w:b w:val="false"/>
+                <w:bCs w:val="false"/>
+                <w:sz w:val="20"/>
+                <w:szCs w:val="20"/>
+              </w:rPr>
+              <w:t>0.059</w:t>
+            </w:r>
+          </w:p>
+        </w:tc>
+        <w:tc>
+          <w:tcPr>
+            <w:tcW w:type="dxa" w:w="2280"/>
+            <w:tcBorders>
+              <w:top w:val="single" w:color="000000" w:sz="6"/>
+              <w:left w:val="single" w:color="000000" w:sz="6"/>
+              <w:bottom w:val="single" w:color="000000" w:sz="6"/>
+              <w:right w:val="single" w:color="000000" w:sz="6"/>
+            </w:tcBorders>
+            <w:tcMar>
+              <w:top w:type="dxa" w:w="80"/>
+              <w:left w:type="dxa" w:w="120"/>
+              <w:bottom w:type="dxa" w:w="80"/>
+              <w:right w:type="dxa" w:w="120"/>
+            </w:tcMar>
+            <w:vAlign w:val="center"/>
+          </w:tcPr>
+          <w:p>
+            <w:pPr>
+              <w:spacing w:after="0" w:before="0"/>
+              <w:jc w:val="center"/>
+            </w:pPr>
+            <w:r>
+              <w:rPr>
+                <w:rFonts w:ascii="Times New Roman" w:cs="Times New Roman" w:eastAsia="Times New Roman" w:hAnsi="Times New Roman"/>
+                <w:b w:val="false"/>
+                <w:bCs w:val="false"/>
+                <w:sz w:val="20"/>
+                <w:szCs w:val="20"/>
+              </w:rPr>
+              <w:t>negligible</w:t>
+            </w:r>
+          </w:p>
+        </w:tc>
+        <w:tc>
+          <w:tcPr>
+            <w:tcW w:type="dxa" w:w="2000"/>
+            <w:tcBorders>
+              <w:top w:val="single" w:color="000000" w:sz="6"/>
+              <w:left w:val="single" w:color="000000" w:sz="6"/>
+              <w:bottom w:val="single" w:color="000000" w:sz="6"/>
+              <w:right w:val="single" w:color="000000" w:sz="6"/>
+            </w:tcBorders>
+            <w:tcMar>
+              <w:top w:type="dxa" w:w="80"/>
+              <w:left w:type="dxa" w:w="120"/>
+              <w:bottom w:type="dxa" w:w="80"/>
+              <w:right w:type="dxa" w:w="120"/>
+            </w:tcMar>
+            <w:vAlign w:val="center"/>
+          </w:tcPr>
+          <w:p>
+            <w:pPr>
+              <w:spacing w:after="0" w:before="0"/>
+              <w:jc w:val="center"/>
+            </w:pPr>
+            <w:r>
+              <w:rPr>
+                <w:rFonts w:ascii="Times New Roman" w:cs="Times New Roman" w:eastAsia="Times New Roman" w:hAnsi="Times New Roman"/>
+                <w:b w:val="false"/>
+                <w:bCs w:val="false"/>
+                <w:sz w:val="20"/>
+                <w:szCs w:val="20"/>
+              </w:rPr>
+              <w:t>Negligible practical effect</w:t>
             </w:r>
           </w:p>
         </w:tc>
@@ -7420,7 +8542,7 @@
           <w:sz w:val="24"/>
           <w:szCs w:val="24"/>
         </w:rPr>
-        <w:t xml:space="preserve">The accuracy gap is statistically significant but small in practical magnitude. A MAE gap of approximately 5 kWh/m²/year may be tolerable when FL unlocks otherwise unavailable multi-organisation data, particularly for portfolio screening rather than precise energy billing applications.</w:t>
+        <w:t>The accuracy gap is statistically significant but small in practical magnitude. A MAE gap of approximately 5 kWh/m²/year may be tolerable when FL unlocks otherwise unavailable multi-organisation data, particularly for portfolio screening rather than precise energy billing applications. Bootstrap 95% confidence intervals (n = 2,000) for RMSE are [105.94, 120.08] for Gradient Boosting and [110.81, 125.43] for the federated MLP. The intervals overlap, and Cohen's d on absolute errors is 0.059 (negligible). Together with the significant paired tests, this supports H1's practical reading: the federated–central gap is detectable but small in magnitude.</w:t>
       </w:r>
     </w:p>
     <w:p>
@@ -7455,7 +8577,7 @@
           <w:sz w:val="24"/>
           <w:szCs w:val="24"/>
         </w:rPr>
-        <w:t xml:space="preserve">Figure 4.1 shows the SHAP feature importance comparison between the centralised Random Forest and the federated weighted-average model. Figure 4.2 shows the full federated SHAP summary.</w:t>
+        <w:t>The primary H2 result uses KernelExplainer on the best centralised model (Gradient Boosting) and the federated MLP: Spearman ρ = 0.956 (p ≈ 5.7 × 10⁻⁴⁷). Figure 4.11 is a supplementary comparison of federated weighted-average SHAP against centralised Random Forest attributions (scripts/run_federated_shap.py). Rank correlation for that RF–federated pair is ρ = 0.776 (top-5 Jaccard = 0.667), showing recognisable but not identical rankings across model families. Figure 4.12 shows the full federated SHAP summary.</w:t>
       </w:r>
     </w:p>
     <w:p>
@@ -7510,6 +8632,7 @@
     </w:p>
     <w:p>
       <w:pPr>
+        <w:pStyle w:val="Caption"/>
         <w:spacing w:after="200" w:before="60"/>
         <w:jc w:val="center"/>
       </w:pPr>
@@ -7523,7 +8646,7 @@
           <w:sz w:val="20"/>
           <w:szCs w:val="20"/>
         </w:rPr>
-        <w:t xml:space="preserve">Figure 4.1: SHAP comparison — Centralised RF vs Federated weighted average. Blue = centralised; orange = federated. Feature rankings show strong agreement across training regimes.</w:t>
+        <w:t>Figure 4.11: SHAP comparison — Centralised RF vs Federated weighted average. Blue = centralised Random Forest; orange = federated. Top ranks agree (storey count, offices); some property-type codes diverge, as expected when comparing a tree ensemble with a neural model. This figure is not the H2 test.</w:t>
       </w:r>
     </w:p>
     <w:p>
@@ -7578,6 +8701,7 @@
     </w:p>
     <w:p>
       <w:pPr>
+        <w:pStyle w:val="Caption"/>
         <w:spacing w:after="200" w:before="60"/>
         <w:jc w:val="center"/>
       </w:pPr>
@@ -7591,7 +8715,7 @@
           <w:sz w:val="20"/>
           <w:szCs w:val="20"/>
         </w:rPr>
-        <w:t xml:space="preserve">Figure 4.2: Federated SHAP summary (weighted client aggregation). num__storey_count dominates, followed by commercial property type indicators and fuel type.</w:t>
+        <w:t>Figure 4.12: Federated SHAP summary (weighted client aggregation). num__storey_count dominates, followed by commercial property type indicators and fuel type.</w:t>
       </w:r>
     </w:p>
     <w:p>
@@ -7614,7 +8738,7 @@
           <w:sz w:val="24"/>
           <w:szCs w:val="24"/>
         </w:rPr>
-        <w:t xml:space="preserve">Spearman rank correlation between centralised and federated mean |SHAP| profiles: ρ = 0.956, p ≈ 5.7 × 10⁻⁴⁷. This extremely high stability indicates that features important under pooled training remain important under federated training.</w:t>
+        <w:t>Primary H2 (Gradient Boosting KernelSHAP vs federated MLP): Spearman ρ = 0.956, p ≈ 5.7 × 10⁻⁴⁷. This high stability indicates that features important under pooled boosting remain important under federated neural training. The RF–federated comparison in Figure 4.11 is a stricter cross-family check (ρ = 0.776) and is not the H2 test statistic.</w:t>
       </w:r>
     </w:p>
     <w:p>
@@ -9089,7 +10213,7 @@
                 <w:sz w:val="20"/>
                 <w:szCs w:val="20"/>
               </w:rPr>
-              <w:t xml:space="preserve">num__floor_area</w:t>
+              <w:t>cat__property_type_C1 Hotels</w:t>
             </w:r>
           </w:p>
         </w:tc>
@@ -9123,7 +10247,7 @@
                 <w:sz w:val="20"/>
                 <w:szCs w:val="20"/>
               </w:rPr>
-              <w:t xml:space="preserve">1.2</w:t>
+              <w:t>7.6</w:t>
             </w:r>
           </w:p>
         </w:tc>
@@ -9157,7 +10281,7 @@
                 <w:sz w:val="20"/>
                 <w:szCs w:val="20"/>
               </w:rPr>
-              <w:t xml:space="preserve">11.4</w:t>
+              <w:t>11.5</w:t>
             </w:r>
           </w:p>
         </w:tc>
@@ -9178,7 +10302,7 @@
           <w:sz w:val="20"/>
           <w:szCs w:val="20"/>
         </w:rPr>
-        <w:t xml:space="preserve">Table 4.5: Top-10 feature importance rankings — federated vs centralised SHAP (mean absolute SHAP values)</w:t>
+        <w:t>Table 4.5: Top-10 federated weighted SHAP rankings compared with centralised Random Forest mean |SHAP| (not the Gradient Boosting KernelSHAP vectors used for H2).</w:t>
       </w:r>
     </w:p>
     <w:p>
@@ -9201,7 +10325,78 @@
           <w:sz w:val="24"/>
           <w:szCs w:val="24"/>
         </w:rPr>
-        <w:t xml:space="preserve">Answer to RQ2: Federated SHAP explanations are highly stable relative to centralised rankings on this corpus (ρ = 0.956). Answer to RQ3: Dominant features are storey count, commercial property type categories, and natural gas fuel — consistent across training regimes and aligned with building physics theory.</w:t>
+        <w:t>Answer to RQ2: Federated SHAP explanations are highly stable relative to centralised Gradient Boosting rankings on this corpus (ρ = 0.956). Answer to RQ3: Dominant features are storey count, commercial property type categories, and natural gas fuel — consistent across training regimes and aligned with building physics theory.</w:t>
+      </w:r>
+    </w:p>
+    <w:p>
+      <w:r>
+        <w:rPr>
+          <w:rFonts w:ascii="Times New Roman" w:hAnsi="Times New Roman"/>
+          <w:sz w:val="22"/>
+        </w:rPr>
+        <w:t>Hypothesis H3 (cross-client top-5 consistency) was evaluated by ranking mean |SHAP| features separately on London, Manchester, and Birmingham client matrices using the centralised Gradient Boosting model (TreeExplainer). Average pairwise Jaccard similarity of the top-5 sets was 0.78 (London–Manchester 0.67; London–Birmingham 0.67; Manchester–Birmingham 1.00). 4/5 top features appeared in all three clients, and 5/5 appeared in at least two clients. H3 STATUS: PASS (average Jaccard 0.78 &gt; 0.60; 4/5 features in all three clients). Figure 4.13 compares per-client mean |SHAP| for the leading features.</w:t>
+      </w:r>
+    </w:p>
+    <w:p>
+      <w:r>
+        <w:rPr>
+          <w:rFonts w:ascii="Times New Roman" w:hAnsi="Times New Roman"/>
+          <w:sz w:val="22"/>
+        </w:rPr>
+        <w:t>Shared across all clients: storey_count, Offices and Workshop Businesses, Storage or Distribution, and Natural Gas. Hotel-related property-type codes differ slightly in naming between London (C1 Hotels) and the other cities (Hotels), which accounts for the only top-5 disagreement.</w:t>
+      </w:r>
+    </w:p>
+    <w:p/>
+    <w:p>
+      <w:pPr>
+        <w:jc w:val="center"/>
+      </w:pPr>
+      <w:r>
+        <w:drawing>
+          <wp:inline xmlns:a="http://schemas.openxmlformats.org/drawingml/2006/main" xmlns:pic="http://schemas.openxmlformats.org/drawingml/2006/picture">
+            <wp:extent cx="5220000" cy="2610000"/>
+            <wp:docPr id="23" name="Picture 23"/>
+            <wp:cNvGraphicFramePr>
+              <a:graphicFrameLocks noChangeAspect="1"/>
+            </wp:cNvGraphicFramePr>
+            <a:graphic>
+              <a:graphicData uri="http://schemas.openxmlformats.org/drawingml/2006/picture">
+                <pic:pic>
+                  <pic:nvPicPr>
+                    <pic:cNvPr id="0" name="per_client_shap_comparison.png"/>
+                    <pic:cNvPicPr/>
+                  </pic:nvPicPr>
+                  <pic:blipFill>
+                    <a:blip r:embed="rId23"/>
+                    <a:stretch>
+                      <a:fillRect/>
+                    </a:stretch>
+                  </pic:blipFill>
+                  <pic:spPr>
+                    <a:xfrm>
+                      <a:off x="0" y="0"/>
+                      <a:ext cx="5220000" cy="2610000"/>
+                    </a:xfrm>
+                    <a:prstGeom prst="rect"/>
+                  </pic:spPr>
+                </pic:pic>
+              </a:graphicData>
+            </a:graphic>
+          </wp:inline>
+        </w:drawing>
+      </w:r>
+    </w:p>
+    <w:p>
+      <w:pPr>
+        <w:pStyle w:val="Caption"/>
+        <w:jc w:val="center"/>
+      </w:pPr>
+      <w:r>
+        <w:rPr>
+          <w:i/>
+          <w:sz w:val="20"/>
+        </w:rPr>
+        <w:t>Figure 4.13: Per-client SHAP comparison (centralised Gradient Boosting applied to each city). Bars show mean |SHAP| for the top features by city.</w:t>
       </w:r>
     </w:p>
     <w:p>
@@ -9236,7 +10431,7 @@
           <w:sz w:val="24"/>
           <w:szCs w:val="24"/>
         </w:rPr>
-        <w:t xml:space="preserve">The Streamlit application at src/webapp/app.py loads artefacts and serves interactive predictions with SHAP global importance tables and LIME local explanations. Figure 4.3 shows the application interface during verification on 18 July 2026, demonstrating a successful prediction of 103.0 kWh/m²/year (Illustrative EPC Band C) for a commercial building in London.</w:t>
+        <w:t>The Streamlit application at src/webapp/app.py loads artefacts and serves interactive predictions with SHAP global importance tables and LIME local explanations. Figure 4.14 shows the application interface during verification on 18 July 2026, demonstrating a successful prediction of 103.0 kWh/m²/year (Illustrative EPC Band C) for a commercial building in London.</w:t>
       </w:r>
     </w:p>
     <w:p>
@@ -9291,6 +10486,7 @@
     </w:p>
     <w:p>
       <w:pPr>
+        <w:pStyle w:val="Caption"/>
         <w:spacing w:after="200" w:before="60"/>
         <w:jc w:val="center"/>
       </w:pPr>
@@ -9304,7 +10500,7 @@
           <w:sz w:val="20"/>
           <w:szCs w:val="20"/>
         </w:rPr>
-        <w:t xml:space="preserve">Figure 4.3: PP-XAI Streamlit prototype (localhost:8501, verified 18 July 2026). Shows prediction, global SHAP importance table, and LIME local explanation with EU AI Act transparency note.</w:t>
+        <w:t>Figure 4.14: PP-XAI Streamlit prototype (localhost:8501, verified 18 July 2026). Shows prediction, global SHAP importance table, and LIME local explanation with EU AI Act transparency note.</w:t>
       </w:r>
     </w:p>
     <w:p>
@@ -9558,7 +10754,7 @@
                 <w:sz w:val="20"/>
                 <w:szCs w:val="20"/>
               </w:rPr>
-              <w:t xml:space="preserve">FedAvg MLP R² 0.517 ≈ central MLP 0.528; close to best GB 0.559</w:t>
+              <w:t>FedAvg MLP R² 0.518 ≈ central MLP 0.528; close to best GB 0.559; H1 supported (within ~5% RMSE of central MLP)</w:t>
             </w:r>
           </w:p>
         </w:tc>
@@ -9663,7 +10859,7 @@
                 <w:sz w:val="20"/>
                 <w:szCs w:val="20"/>
               </w:rPr>
-              <w:t xml:space="preserve">Spearman ρ = 0.956 between central and federated — very high</w:t>
+              <w:t>Spearman ρ = 0.956 between central GB and federated MLP — very high (H2). RF–federated supplementary ρ = 0.776</w:t>
             </w:r>
           </w:p>
         </w:tc>
@@ -9768,7 +10964,7 @@
                 <w:sz w:val="20"/>
                 <w:szCs w:val="20"/>
               </w:rPr>
-              <w:t xml:space="preserve">Storey count, property type, fuel dominate; consistent across settings</w:t>
+              <w:t>Storey count, property type, fuel dominate; H3 PASS (avg Jaccard 0.78; 4/5 top-5 features in all clients)</w:t>
             </w:r>
           </w:p>
         </w:tc>
@@ -9895,6 +11091,15 @@
           <w:szCs w:val="20"/>
         </w:rPr>
         <w:t xml:space="preserve">Table 4.6: Summary of empirical answers to research questions</w:t>
+      </w:r>
+    </w:p>
+    <w:p>
+      <w:r>
+        <w:rPr>
+          <w:rFonts w:ascii="Times New Roman" w:hAnsi="Times New Roman"/>
+          <w:sz w:val="22"/>
+        </w:rPr>
+        <w:t>Hypothesis verdicts: H1 supported (federated RMSE 118.21 within ~5% of central MLP 117.04; bootstrap CIs overlap; Cohen's d = 0.059). H2 supported (Gradient Boosting vs federated MLP Spearman ρ = 0.956 &gt; 0.85). H3 PASS (average Jaccard = 0.78). H4 supported qualitatively via the Streamlit prototype with an EU AI Act Article 13 transparency note.</w:t>
       </w:r>
     </w:p>
     <w:p>
@@ -10023,7 +11228,7 @@
           <w:sz w:val="24"/>
           <w:szCs w:val="24"/>
         </w:rPr>
-        <w:t xml:space="preserve">A Spearman correlation of 0.956 between centralised and federated mean |SHAP| profiles suggests that privacy-preserving training did not arbitrarily reshuffle feature importance. For RQ2 and RQ4, this matters: transparency artefacts remain recognisable across governance modes. Practitioners could, in principle, publish SHAP summaries of a federated model to inform retrofit decisions without implying that underlying microdata were centralised.</w:t>
+        <w:t>A Spearman correlation of 0.956 between centralised Gradient Boosting and federated MLP mean |SHAP| profiles (H2) suggests that privacy-preserving neural training did not arbitrarily reshuffle feature importance relative to the best pooled tree model. For RQ2 and RQ4, this matters: transparency artefacts remain recognisable across governance modes. Practitioners could, in principle, publish SHAP summaries of a federated model to inform retrofit decisions without implying that underlying microdata were centralised.</w:t>
       </w:r>
     </w:p>
     <w:p>
@@ -10059,7 +11264,7 @@
           <w:sz w:val="24"/>
           <w:szCs w:val="24"/>
         </w:rPr>
-        <w:t xml:space="preserve">The divergence in Retail (A1/A2) importance between centralised (9.1) and federated (24.5) models is informative: federated clients weight retail more heavily because London and Birmingham partitions have higher retail concentration than the national pooled dataset would imply. This regional knowledge preservation is a feature of FL, not a failure — it demonstrates that federated models encode local building stock patterns rather than averaging them away.</w:t>
+        <w:t>In the supplementary Random Forest versus federated comparison (Figure 4.11), Retail (A1/A2) mean |SHAP| is 9.1 (RF) versus 24.5 (federated). Part of this gap may reflect model family (tree versus MLP) as well as geographic weighting under FedAvg: federated clients can preserve local retail-stock patterns rather than averaging them away. This is informative, but it is not evidence from the H2 Gradient Boosting comparison.</w:t>
       </w:r>
     </w:p>
     <w:p>
@@ -10235,7 +11440,7 @@
           <w:sz w:val="24"/>
           <w:szCs w:val="24"/>
         </w:rPr>
-        <w:t xml:space="preserve">EPC data were used under OGL v3.0. No re-identification attempts were made. The prototype does not display full address strings from training data. The prototype must not be presented as a certified EPC replacement; it is a research demonstrator. Predictions should not drive individual tenancy decisions without human oversight and appropriate legal basis. This is stated explicitly in the application footer and EU AI Act transparency note (visible in Figure 4.3), aligned with Article 13 obligations for human oversight (European Parliament, 2024).</w:t>
+        <w:t>EPC data were used under OGL v3.0. No re-identification attempts were made. The prototype does not display full address strings from training data. The prototype must not be presented as a certified EPC replacement; it is a research demonstrator. Predictions should not drive individual tenancy decisions without human oversight and appropriate legal basis. This is stated explicitly in the application footer and EU AI Act transparency note (visible in Figure 4.14), aligned with Article 13 obligations for human oversight (European Parliament, 2024).</w:t>
       </w:r>
     </w:p>
     <w:p>
@@ -10452,7 +11657,7 @@
           <w:sz w:val="24"/>
           <w:szCs w:val="24"/>
         </w:rPr>
-        <w:t xml:space="preserve">The central empirical contribution is dual: federated neural models can track centralised neural performance on UK high-rise EPC data (R² 0.517 vs 0.528), and SHAP feature importance rankings remain highly stable across centralised and federated training regimes (Spearman ρ = 0.956). Together, these results demonstrate that privacy-preserving training and explainable outputs can coexist with competitive predictive performance on UK high-rise EPC analytics, provided researchers remain honest about data limitations and leakage risks.</w:t>
+        <w:t>The central empirical contribution is dual: federated neural models can track centralised neural performance on UK high-rise EPC data (R² 0.518 vs 0.528), and SHAP feature importance rankings remain highly stable between centralised Gradient Boosting and federated MLP training (Spearman ρ = 0.956). Together, these results demonstrate that privacy-preserving training and explainable outputs can coexist with competitive predictive performance on UK high-rise EPC analytics, provided researchers remain honest about data limitations and leakage risks.</w:t>
       </w:r>
     </w:p>
     <w:p>
@@ -10487,19 +11692,18 @@
           <w:sz w:val="24"/>
           <w:szCs w:val="24"/>
         </w:rPr>
-        <w:t xml:space="preserve">RQ1: </w:t>
-      </w:r>
-      <w:r>
-        <w:rPr>
-          <w:rFonts w:ascii="Times New Roman" w:cs="Times New Roman" w:eastAsia="Times New Roman" w:hAnsi="Times New Roman"/>
-          <w:b w:val="false"/>
-          <w:bCs w:val="false"/>
-          <w:caps w:val="false"/>
-          <w:color w:val="000000"/>
-          <w:sz w:val="24"/>
-          <w:szCs w:val="24"/>
-        </w:rPr>
-        <w:t xml:space="preserve">Federated Averaging produced an MLP with R² ≈ 0.517, closely matching the centralised MLP (0.528) and approaching the best centralised Gradient Boosting (0.559), without pooling raw client CSVs during federated rounds.</w:t>
+        <w:t>RQ1: Federated Averaging produced an MLP with R² ≈ 0.518, closely matching the centralised MLP (0.528) and approaching the best centralised Gradient Boosting (0.559), without pooling raw client CSVs during federated rounds.</w:t>
+      </w:r>
+      <w:r>
+        <w:rPr>
+          <w:rFonts w:ascii="Times New Roman" w:cs="Times New Roman" w:eastAsia="Times New Roman" w:hAnsi="Times New Roman"/>
+          <w:b w:val="false"/>
+          <w:bCs w:val="false"/>
+          <w:caps w:val="false"/>
+          <w:color w:val="000000"/>
+          <w:sz w:val="24"/>
+          <w:szCs w:val="24"/>
+        </w:rPr>
       </w:r>
     </w:p>
     <w:p>
@@ -10517,19 +11721,18 @@
           <w:sz w:val="24"/>
           <w:szCs w:val="24"/>
         </w:rPr>
-        <w:t xml:space="preserve">RQ2: </w:t>
-      </w:r>
-      <w:r>
-        <w:rPr>
-          <w:rFonts w:ascii="Times New Roman" w:cs="Times New Roman" w:eastAsia="Times New Roman" w:hAnsi="Times New Roman"/>
-          <w:b w:val="false"/>
-          <w:bCs w:val="false"/>
-          <w:caps w:val="false"/>
-          <w:color w:val="000000"/>
-          <w:sz w:val="24"/>
-          <w:szCs w:val="24"/>
-        </w:rPr>
-        <w:t xml:space="preserve">Global SHAP rankings were highly stable across centralised and federated models (Spearman ρ = 0.956, p &lt; 10⁻⁴⁰).</w:t>
+        <w:t>RQ2: Global SHAP rankings were highly stable between centralised Gradient Boosting and the federated MLP (Spearman ρ = 0.956, p &lt; 10⁻⁴⁰).</w:t>
+      </w:r>
+      <w:r>
+        <w:rPr>
+          <w:rFonts w:ascii="Times New Roman" w:cs="Times New Roman" w:eastAsia="Times New Roman" w:hAnsi="Times New Roman"/>
+          <w:b w:val="false"/>
+          <w:bCs w:val="false"/>
+          <w:caps w:val="false"/>
+          <w:color w:val="000000"/>
+          <w:sz w:val="24"/>
+          <w:szCs w:val="24"/>
+        </w:rPr>
       </w:r>
     </w:p>
     <w:p>
@@ -10687,19 +11890,18 @@
           <w:sz w:val="24"/>
           <w:szCs w:val="24"/>
         </w:rPr>
-        <w:t xml:space="preserve">• </w:t>
-      </w:r>
-      <w:r>
-        <w:rPr>
-          <w:rFonts w:ascii="Times New Roman" w:cs="Times New Roman" w:eastAsia="Times New Roman" w:hAnsi="Times New Roman"/>
-          <w:b w:val="false"/>
-          <w:bCs w:val="false"/>
-          <w:caps w:val="false"/>
-          <w:color w:val="000000"/>
-          <w:sz w:val="24"/>
-          <w:szCs w:val="24"/>
-        </w:rPr>
-        <w:t xml:space="preserve">Quantitative XAI stability evidence: Spearman ρ = 0.956 linking FL and explainability evaluation on the same test subsample.</w:t>
+        <w:t>• Quantitative XAI stability evidence: Spearman ρ = 0.956 between Gradient Boosting KernelSHAP and federated MLP attributions on the same test subsample.</w:t>
+      </w:r>
+      <w:r>
+        <w:rPr>
+          <w:rFonts w:ascii="Times New Roman" w:cs="Times New Roman" w:eastAsia="Times New Roman" w:hAnsi="Times New Roman"/>
+          <w:b w:val="false"/>
+          <w:bCs w:val="false"/>
+          <w:caps w:val="false"/>
+          <w:color w:val="000000"/>
+          <w:sz w:val="24"/>
+          <w:szCs w:val="24"/>
+        </w:rPr>
       </w:r>
     </w:p>
     <w:p>
@@ -12244,445 +13446,201 @@
         <w:t xml:space="preserve">B.4 Figure Reference Guide</w:t>
       </w:r>
     </w:p>
-    <w:tbl>
-      <w:tblPr>
-        <w:tblW w:type="dxa" w:w="9360"/>
-        <w:tblBorders>
-          <w:top w:val="single" w:color="auto" w:sz="4"/>
-          <w:left w:val="single" w:color="auto" w:sz="4"/>
-          <w:bottom w:val="single" w:color="auto" w:sz="4"/>
-          <w:right w:val="single" w:color="auto" w:sz="4"/>
-          <w:insideH w:val="single" w:color="auto" w:sz="4"/>
-          <w:insideV w:val="single" w:color="auto" w:sz="4"/>
-        </w:tblBorders>
-      </w:tblPr>
-      <w:tblGrid>
-        <w:gridCol w:w="3500"/>
-        <w:gridCol w:w="5860"/>
-      </w:tblGrid>
-      <w:tr>
-        <w:tc>
-          <w:tcPr>
-            <w:tcW w:type="dxa" w:w="3500"/>
-            <w:tcBorders>
-              <w:top w:val="single" w:color="000000" w:sz="6"/>
-              <w:left w:val="single" w:color="000000" w:sz="6"/>
-              <w:bottom w:val="single" w:color="000000" w:sz="6"/>
-              <w:right w:val="single" w:color="000000" w:sz="6"/>
-            </w:tcBorders>
-            <w:shd w:fill="1F3864" w:val="clear"/>
-            <w:tcMar>
-              <w:top w:type="dxa" w:w="80"/>
-              <w:left w:type="dxa" w:w="120"/>
-              <w:bottom w:type="dxa" w:w="80"/>
-              <w:right w:type="dxa" w:w="120"/>
-            </w:tcMar>
-            <w:vAlign w:val="center"/>
-          </w:tcPr>
-          <w:p>
-            <w:pPr>
-              <w:spacing w:after="0" w:before="0"/>
-              <w:jc w:val="center"/>
-            </w:pPr>
-            <w:r>
-              <w:rPr>
-                <w:rFonts w:ascii="Times New Roman" w:cs="Times New Roman" w:eastAsia="Times New Roman" w:hAnsi="Times New Roman"/>
-                <w:b/>
-                <w:bCs/>
-                <w:sz w:val="20"/>
-                <w:szCs w:val="20"/>
-              </w:rPr>
-              <w:t xml:space="preserve">Figure File</w:t>
-            </w:r>
-          </w:p>
-        </w:tc>
-        <w:tc>
-          <w:tcPr>
-            <w:tcW w:type="dxa" w:w="5860"/>
-            <w:tcBorders>
-              <w:top w:val="single" w:color="000000" w:sz="6"/>
-              <w:left w:val="single" w:color="000000" w:sz="6"/>
-              <w:bottom w:val="single" w:color="000000" w:sz="6"/>
-              <w:right w:val="single" w:color="000000" w:sz="6"/>
-            </w:tcBorders>
-            <w:shd w:fill="1F3864" w:val="clear"/>
-            <w:tcMar>
-              <w:top w:type="dxa" w:w="80"/>
-              <w:left w:type="dxa" w:w="120"/>
-              <w:bottom w:type="dxa" w:w="80"/>
-              <w:right w:type="dxa" w:w="120"/>
-            </w:tcMar>
-            <w:vAlign w:val="center"/>
-          </w:tcPr>
-          <w:p>
-            <w:pPr>
-              <w:spacing w:after="0" w:before="0"/>
-              <w:jc w:val="center"/>
-            </w:pPr>
-            <w:r>
-              <w:rPr>
-                <w:rFonts w:ascii="Times New Roman" w:cs="Times New Roman" w:eastAsia="Times New Roman" w:hAnsi="Times New Roman"/>
-                <w:b/>
-                <w:bCs/>
-                <w:sz w:val="20"/>
-                <w:szCs w:val="20"/>
-              </w:rPr>
-              <w:t xml:space="preserve">Description for Viva</w:t>
-            </w:r>
-          </w:p>
-        </w:tc>
-      </w:tr>
-      <w:tr>
-        <w:tc>
-          <w:tcPr>
-            <w:tcW w:type="dxa" w:w="3500"/>
-            <w:tcBorders>
-              <w:top w:val="single" w:color="000000" w:sz="6"/>
-              <w:left w:val="single" w:color="000000" w:sz="6"/>
-              <w:bottom w:val="single" w:color="000000" w:sz="6"/>
-              <w:right w:val="single" w:color="000000" w:sz="6"/>
-            </w:tcBorders>
-            <w:tcMar>
-              <w:top w:type="dxa" w:w="80"/>
-              <w:left w:type="dxa" w:w="120"/>
-              <w:bottom w:type="dxa" w:w="80"/>
-              <w:right w:type="dxa" w:w="120"/>
-            </w:tcMar>
-            <w:vAlign w:val="center"/>
-          </w:tcPr>
-          <w:p>
-            <w:pPr>
-              <w:spacing w:after="0" w:before="0"/>
-              <w:jc w:val="left"/>
-            </w:pPr>
-            <w:r>
-              <w:rPr>
-                <w:rFonts w:ascii="Times New Roman" w:cs="Times New Roman" w:eastAsia="Times New Roman" w:hAnsi="Times New Roman"/>
-                <w:b w:val="false"/>
-                <w:bCs w:val="false"/>
-                <w:sz w:val="20"/>
-                <w:szCs w:val="20"/>
-              </w:rPr>
-              <w:t xml:space="preserve">eda_target_hist.png</w:t>
-            </w:r>
-          </w:p>
-        </w:tc>
-        <w:tc>
-          <w:tcPr>
-            <w:tcW w:type="dxa" w:w="5860"/>
-            <w:tcBorders>
-              <w:top w:val="single" w:color="000000" w:sz="6"/>
-              <w:left w:val="single" w:color="000000" w:sz="6"/>
-              <w:bottom w:val="single" w:color="000000" w:sz="6"/>
-              <w:right w:val="single" w:color="000000" w:sz="6"/>
-            </w:tcBorders>
-            <w:tcMar>
-              <w:top w:type="dxa" w:w="80"/>
-              <w:left w:type="dxa" w:w="120"/>
-              <w:bottom w:type="dxa" w:w="80"/>
-              <w:right w:type="dxa" w:w="120"/>
-            </w:tcMar>
-            <w:vAlign w:val="center"/>
-          </w:tcPr>
-          <w:p>
-            <w:pPr>
-              <w:spacing w:after="0" w:before="0"/>
-              <w:jc w:val="left"/>
-            </w:pPr>
-            <w:r>
-              <w:rPr>
-                <w:rFonts w:ascii="Times New Roman" w:cs="Times New Roman" w:eastAsia="Times New Roman" w:hAnsi="Times New Roman"/>
-                <w:b w:val="false"/>
-                <w:bCs w:val="false"/>
-                <w:sz w:val="20"/>
-                <w:szCs w:val="20"/>
-              </w:rPr>
-              <w:t xml:space="preserve">Target distribution is right-skewed; justifies 1st–99th percentile clipping</w:t>
-            </w:r>
-          </w:p>
-        </w:tc>
-      </w:tr>
-      <w:tr>
-        <w:tc>
-          <w:tcPr>
-            <w:tcW w:type="dxa" w:w="3500"/>
-            <w:tcBorders>
-              <w:top w:val="single" w:color="000000" w:sz="6"/>
-              <w:left w:val="single" w:color="000000" w:sz="6"/>
-              <w:bottom w:val="single" w:color="000000" w:sz="6"/>
-              <w:right w:val="single" w:color="000000" w:sz="6"/>
-            </w:tcBorders>
-            <w:tcMar>
-              <w:top w:type="dxa" w:w="80"/>
-              <w:left w:type="dxa" w:w="120"/>
-              <w:bottom w:type="dxa" w:w="80"/>
-              <w:right w:type="dxa" w:w="120"/>
-            </w:tcMar>
-            <w:vAlign w:val="center"/>
-          </w:tcPr>
-          <w:p>
-            <w:pPr>
-              <w:spacing w:after="0" w:before="0"/>
-              <w:jc w:val="left"/>
-            </w:pPr>
-            <w:r>
-              <w:rPr>
-                <w:rFonts w:ascii="Times New Roman" w:cs="Times New Roman" w:eastAsia="Times New Roman" w:hAnsi="Times New Roman"/>
-                <w:b w:val="false"/>
-                <w:bCs w:val="false"/>
-                <w:sz w:val="20"/>
-                <w:szCs w:val="20"/>
-              </w:rPr>
-              <w:t xml:space="preserve">eda_city_counts.png</w:t>
-            </w:r>
-          </w:p>
-        </w:tc>
-        <w:tc>
-          <w:tcPr>
-            <w:tcW w:type="dxa" w:w="5860"/>
-            <w:tcBorders>
-              <w:top w:val="single" w:color="000000" w:sz="6"/>
-              <w:left w:val="single" w:color="000000" w:sz="6"/>
-              <w:bottom w:val="single" w:color="000000" w:sz="6"/>
-              <w:right w:val="single" w:color="000000" w:sz="6"/>
-            </w:tcBorders>
-            <w:tcMar>
-              <w:top w:type="dxa" w:w="80"/>
-              <w:left w:type="dxa" w:w="120"/>
-              <w:bottom w:type="dxa" w:w="80"/>
-              <w:right w:type="dxa" w:w="120"/>
-            </w:tcMar>
-            <w:vAlign w:val="center"/>
-          </w:tcPr>
-          <w:p>
-            <w:pPr>
-              <w:spacing w:after="0" w:before="0"/>
-              <w:jc w:val="left"/>
-            </w:pPr>
-            <w:r>
-              <w:rPr>
-                <w:rFonts w:ascii="Times New Roman" w:cs="Times New Roman" w:eastAsia="Times New Roman" w:hAnsi="Times New Roman"/>
-                <w:b w:val="false"/>
-                <w:bCs w:val="false"/>
-                <w:sz w:val="20"/>
-                <w:szCs w:val="20"/>
-              </w:rPr>
-              <w:t xml:space="preserve">London dominates sample size — sample-size non-IID</w:t>
-            </w:r>
-          </w:p>
-        </w:tc>
-      </w:tr>
-      <w:tr>
-        <w:tc>
-          <w:tcPr>
-            <w:tcW w:type="dxa" w:w="3500"/>
-            <w:tcBorders>
-              <w:top w:val="single" w:color="000000" w:sz="6"/>
-              <w:left w:val="single" w:color="000000" w:sz="6"/>
-              <w:bottom w:val="single" w:color="000000" w:sz="6"/>
-              <w:right w:val="single" w:color="000000" w:sz="6"/>
-            </w:tcBorders>
-            <w:tcMar>
-              <w:top w:type="dxa" w:w="80"/>
-              <w:left w:type="dxa" w:w="120"/>
-              <w:bottom w:type="dxa" w:w="80"/>
-              <w:right w:type="dxa" w:w="120"/>
-            </w:tcMar>
-            <w:vAlign w:val="center"/>
-          </w:tcPr>
-          <w:p>
-            <w:pPr>
-              <w:spacing w:after="0" w:before="0"/>
-              <w:jc w:val="left"/>
-            </w:pPr>
-            <w:r>
-              <w:rPr>
-                <w:rFonts w:ascii="Times New Roman" w:cs="Times New Roman" w:eastAsia="Times New Roman" w:hAnsi="Times New Roman"/>
-                <w:b w:val="false"/>
-                <w:bCs w:val="false"/>
-                <w:sz w:val="20"/>
-                <w:szCs w:val="20"/>
-              </w:rPr>
-              <w:t xml:space="preserve">federated_convergence.png</w:t>
-            </w:r>
-          </w:p>
-        </w:tc>
-        <w:tc>
-          <w:tcPr>
-            <w:tcW w:type="dxa" w:w="5860"/>
-            <w:tcBorders>
-              <w:top w:val="single" w:color="000000" w:sz="6"/>
-              <w:left w:val="single" w:color="000000" w:sz="6"/>
-              <w:bottom w:val="single" w:color="000000" w:sz="6"/>
-              <w:right w:val="single" w:color="000000" w:sz="6"/>
-            </w:tcBorders>
-            <w:tcMar>
-              <w:top w:type="dxa" w:w="80"/>
-              <w:left w:type="dxa" w:w="120"/>
-              <w:bottom w:type="dxa" w:w="80"/>
-              <w:right w:type="dxa" w:w="120"/>
-            </w:tcMar>
-            <w:vAlign w:val="center"/>
-          </w:tcPr>
-          <w:p>
-            <w:pPr>
-              <w:spacing w:after="0" w:before="0"/>
-              <w:jc w:val="left"/>
-            </w:pPr>
-            <w:r>
-              <w:rPr>
-                <w:rFonts w:ascii="Times New Roman" w:cs="Times New Roman" w:eastAsia="Times New Roman" w:hAnsi="Times New Roman"/>
-                <w:b w:val="false"/>
-                <w:bCs w:val="false"/>
-                <w:sz w:val="20"/>
-                <w:szCs w:val="20"/>
-              </w:rPr>
-              <w:t xml:space="preserve">FL learns across rounds; convergence by round 5–6</w:t>
-            </w:r>
-          </w:p>
-        </w:tc>
-      </w:tr>
-      <w:tr>
-        <w:tc>
-          <w:tcPr>
-            <w:tcW w:type="dxa" w:w="3500"/>
-            <w:tcBorders>
-              <w:top w:val="single" w:color="000000" w:sz="6"/>
-              <w:left w:val="single" w:color="000000" w:sz="6"/>
-              <w:bottom w:val="single" w:color="000000" w:sz="6"/>
-              <w:right w:val="single" w:color="000000" w:sz="6"/>
-            </w:tcBorders>
-            <w:tcMar>
-              <w:top w:type="dxa" w:w="80"/>
-              <w:left w:type="dxa" w:w="120"/>
-              <w:bottom w:type="dxa" w:w="80"/>
-              <w:right w:type="dxa" w:w="120"/>
-            </w:tcMar>
-            <w:vAlign w:val="center"/>
-          </w:tcPr>
-          <w:p>
-            <w:pPr>
-              <w:spacing w:after="0" w:before="0"/>
-              <w:jc w:val="left"/>
-            </w:pPr>
-            <w:r>
-              <w:rPr>
-                <w:rFonts w:ascii="Times New Roman" w:cs="Times New Roman" w:eastAsia="Times New Roman" w:hAnsi="Times New Roman"/>
-                <w:b w:val="false"/>
-                <w:bCs w:val="false"/>
-                <w:sz w:val="20"/>
-                <w:szCs w:val="20"/>
-              </w:rPr>
-              <w:t xml:space="preserve">shap_comparison.png</w:t>
-            </w:r>
-          </w:p>
-        </w:tc>
-        <w:tc>
-          <w:tcPr>
-            <w:tcW w:type="dxa" w:w="5860"/>
-            <w:tcBorders>
-              <w:top w:val="single" w:color="000000" w:sz="6"/>
-              <w:left w:val="single" w:color="000000" w:sz="6"/>
-              <w:bottom w:val="single" w:color="000000" w:sz="6"/>
-              <w:right w:val="single" w:color="000000" w:sz="6"/>
-            </w:tcBorders>
-            <w:tcMar>
-              <w:top w:type="dxa" w:w="80"/>
-              <w:left w:type="dxa" w:w="120"/>
-              <w:bottom w:type="dxa" w:w="80"/>
-              <w:right w:type="dxa" w:w="120"/>
-            </w:tcMar>
-            <w:vAlign w:val="center"/>
-          </w:tcPr>
-          <w:p>
-            <w:pPr>
-              <w:spacing w:after="0" w:before="0"/>
-              <w:jc w:val="left"/>
-            </w:pPr>
-            <w:r>
-              <w:rPr>
-                <w:rFonts w:ascii="Times New Roman" w:cs="Times New Roman" w:eastAsia="Times New Roman" w:hAnsi="Times New Roman"/>
-                <w:b w:val="false"/>
-                <w:bCs w:val="false"/>
-                <w:sz w:val="20"/>
-                <w:szCs w:val="20"/>
-              </w:rPr>
-              <w:t xml:space="preserve">Centralised vs federated SHAP — high visual agreement (Figure 4.1)</w:t>
-            </w:r>
-          </w:p>
-        </w:tc>
-      </w:tr>
-      <w:tr>
-        <w:tc>
-          <w:tcPr>
-            <w:tcW w:type="dxa" w:w="3500"/>
-            <w:tcBorders>
-              <w:top w:val="single" w:color="000000" w:sz="6"/>
-              <w:left w:val="single" w:color="000000" w:sz="6"/>
-              <w:bottom w:val="single" w:color="000000" w:sz="6"/>
-              <w:right w:val="single" w:color="000000" w:sz="6"/>
-            </w:tcBorders>
-            <w:tcMar>
-              <w:top w:type="dxa" w:w="80"/>
-              <w:left w:type="dxa" w:w="120"/>
-              <w:bottom w:type="dxa" w:w="80"/>
-              <w:right w:type="dxa" w:w="120"/>
-            </w:tcMar>
-            <w:vAlign w:val="center"/>
-          </w:tcPr>
-          <w:p>
-            <w:pPr>
-              <w:spacing w:after="0" w:before="0"/>
-              <w:jc w:val="left"/>
-            </w:pPr>
-            <w:r>
-              <w:rPr>
-                <w:rFonts w:ascii="Times New Roman" w:cs="Times New Roman" w:eastAsia="Times New Roman" w:hAnsi="Times New Roman"/>
-                <w:b w:val="false"/>
-                <w:bCs w:val="false"/>
-                <w:sz w:val="20"/>
-                <w:szCs w:val="20"/>
-              </w:rPr>
-              <w:t xml:space="preserve">pred_vs_actual_*.png</w:t>
-            </w:r>
-          </w:p>
-        </w:tc>
-        <w:tc>
-          <w:tcPr>
-            <w:tcW w:type="dxa" w:w="5860"/>
-            <w:tcBorders>
-              <w:top w:val="single" w:color="000000" w:sz="6"/>
-              <w:left w:val="single" w:color="000000" w:sz="6"/>
-              <w:bottom w:val="single" w:color="000000" w:sz="6"/>
-              <w:right w:val="single" w:color="000000" w:sz="6"/>
-            </w:tcBorders>
-            <w:tcMar>
-              <w:top w:type="dxa" w:w="80"/>
-              <w:left w:type="dxa" w:w="120"/>
-              <w:bottom w:type="dxa" w:w="80"/>
-              <w:right w:type="dxa" w:w="120"/>
-            </w:tcMar>
-            <w:vAlign w:val="center"/>
-          </w:tcPr>
-          <w:p>
-            <w:pPr>
-              <w:spacing w:after="0" w:before="0"/>
-              <w:jc w:val="left"/>
-            </w:pPr>
-            <w:r>
-              <w:rPr>
-                <w:rFonts w:ascii="Times New Roman" w:cs="Times New Roman" w:eastAsia="Times New Roman" w:hAnsi="Times New Roman"/>
-                <w:b w:val="false"/>
-                <w:bCs w:val="false"/>
-                <w:sz w:val="20"/>
-                <w:szCs w:val="20"/>
-              </w:rPr>
-              <w:t xml:space="preserve">Errors grow with magnitude; heteroscedastic energy data</w:t>
-            </w:r>
-          </w:p>
-        </w:tc>
-      </w:tr>
-    </w:tbl>
+    <w:p>
+      <w:pPr>
+        <w:pStyle w:val="Normal"/>
+      </w:pPr>
+      <w:r>
+        <w:rPr>
+          <w:rFonts w:ascii="Times New Roman" w:hAnsi="Times New Roman" w:eastAsia="Times New Roman"/>
+          <w:b w:val="0"/>
+          <w:i w:val="0"/>
+          <w:sz w:val="22"/>
+        </w:rPr>
+        <w:t>Figure 4.1 eda_target_hist.png — target distribution is right-skewed; justify clipping.</w:t>
+      </w:r>
+    </w:p>
+    <w:p>
+      <w:pPr>
+        <w:pStyle w:val="Normal"/>
+      </w:pPr>
+      <w:r>
+        <w:rPr>
+          <w:rFonts w:ascii="Times New Roman" w:hAnsi="Times New Roman" w:eastAsia="Times New Roman"/>
+          <w:b w:val="0"/>
+          <w:i w:val="0"/>
+          <w:sz w:val="22"/>
+        </w:rPr>
+        <w:t>Figure 4.2 eda_city_counts.png — London dominates sample size.</w:t>
+      </w:r>
+    </w:p>
+    <w:p>
+      <w:pPr>
+        <w:pStyle w:val="Normal"/>
+      </w:pPr>
+      <w:r>
+        <w:rPr>
+          <w:rFonts w:ascii="Times New Roman" w:hAnsi="Times New Roman" w:eastAsia="Times New Roman"/>
+          <w:b w:val="0"/>
+          <w:i w:val="0"/>
+          <w:sz w:val="22"/>
+        </w:rPr>
+        <w:t>Figure 4.3 eda_energy_by_city.png — distributions broadly similar → mild non-IID.</w:t>
+      </w:r>
+    </w:p>
+    <w:p>
+      <w:pPr>
+        <w:pStyle w:val="Normal"/>
+      </w:pPr>
+      <w:r>
+        <w:rPr>
+          <w:rFonts w:ascii="Times New Roman" w:hAnsi="Times New Roman" w:eastAsia="Times New Roman"/>
+          <w:b w:val="0"/>
+          <w:i w:val="0"/>
+          <w:sz w:val="22"/>
+        </w:rPr>
+        <w:t>Figure 4.4 eda_area_vs_energy.png — cross-sectional area–energy scatter.</w:t>
+      </w:r>
+    </w:p>
+    <w:p>
+      <w:pPr>
+        <w:pStyle w:val="Normal"/>
+      </w:pPr>
+      <w:r>
+        <w:rPr>
+          <w:rFonts w:ascii="Times New Roman" w:hAnsi="Times New Roman" w:eastAsia="Times New Roman"/>
+          <w:b w:val="0"/>
+          <w:i w:val="0"/>
+          <w:sz w:val="22"/>
+        </w:rPr>
+        <w:t>Figure 4.5 baseline_rmse.png — Gradient Boosting wins among central models.</w:t>
+      </w:r>
+    </w:p>
+    <w:p>
+      <w:pPr>
+        <w:pStyle w:val="Normal"/>
+      </w:pPr>
+      <w:r>
+        <w:rPr>
+          <w:rFonts w:ascii="Times New Roman" w:hAnsi="Times New Roman" w:eastAsia="Times New Roman"/>
+          <w:b w:val="0"/>
+          <w:i w:val="0"/>
+          <w:sz w:val="22"/>
+        </w:rPr>
+        <w:t>Figure 4.6 baseline_r2.png — moderate absolute R² for EPC intensity.</w:t>
+      </w:r>
+    </w:p>
+    <w:p>
+      <w:pPr>
+        <w:pStyle w:val="Normal"/>
+      </w:pPr>
+      <w:r>
+        <w:rPr>
+          <w:rFonts w:ascii="Times New Roman" w:hAnsi="Times New Roman" w:eastAsia="Times New Roman"/>
+          <w:b w:val="0"/>
+          <w:i w:val="0"/>
+          <w:sz w:val="22"/>
+        </w:rPr>
+        <w:t>Figure 4.7 pred_vs_actual_gradient_boosting.png — errors grow with magnitude.</w:t>
+      </w:r>
+    </w:p>
+    <w:p>
+      <w:r>
+        <w:rPr>
+          <w:rFonts w:ascii="Times New Roman" w:hAnsi="Times New Roman"/>
+          <w:sz w:val="22"/>
+        </w:rPr>
+        <w:t>Figure 4.7b pred_vs_actual_mlp.png — central MLP residuals on held-out test set.</w:t>
+      </w:r>
+    </w:p>
+    <w:p>
+      <w:pPr>
+        <w:pStyle w:val="Normal"/>
+      </w:pPr>
+      <w:r>
+        <w:rPr>
+          <w:rFonts w:ascii="Times New Roman" w:hAnsi="Times New Roman" w:eastAsia="Times New Roman"/>
+          <w:b w:val="0"/>
+          <w:i w:val="0"/>
+          <w:sz w:val="22"/>
+        </w:rPr>
+        <w:t>Figure 4.8 federated_convergence.png — FedAvg vs FedProx over eight rounds; both converge by round 6.</w:t>
+      </w:r>
+    </w:p>
+    <w:p>
+      <w:pPr>
+        <w:pStyle w:val="Normal"/>
+      </w:pPr>
+      <w:r>
+        <w:rPr>
+          <w:rFonts w:ascii="Times New Roman" w:hAnsi="Times New Roman" w:eastAsia="Times New Roman"/>
+          <w:b w:val="0"/>
+          <w:i w:val="0"/>
+          <w:sz w:val="22"/>
+        </w:rPr>
+        <w:t>Figure 4.9 pred_vs_actual_federated.png — federated residuals vs actual.</w:t>
+      </w:r>
+    </w:p>
+    <w:p>
+      <w:pPr>
+        <w:pStyle w:val="Normal"/>
+      </w:pPr>
+      <w:r>
+        <w:rPr>
+          <w:rFonts w:ascii="Times New Roman" w:hAnsi="Times New Roman" w:eastAsia="Times New Roman"/>
+          <w:b w:val="0"/>
+          <w:i w:val="0"/>
+          <w:sz w:val="22"/>
+        </w:rPr>
+        <w:t>Figure 4.10 federated_convergence_20rounds.png — independent 20-round FedAvg vs FedProx with central baselines.</w:t>
+      </w:r>
+    </w:p>
+    <w:p>
+      <w:pPr>
+        <w:pStyle w:val="Normal"/>
+      </w:pPr>
+      <w:r>
+        <w:rPr>
+          <w:rFonts w:ascii="Times New Roman" w:hAnsi="Times New Roman" w:eastAsia="Times New Roman"/>
+          <w:b w:val="0"/>
+          <w:i w:val="0"/>
+          <w:sz w:val="22"/>
+        </w:rPr>
+        <w:t>Figure 4.11 shap_comparison.png — supplementary RF vs federated SHAP (not the H2 Gradient Boosting test).</w:t>
+      </w:r>
+    </w:p>
+    <w:p>
+      <w:pPr>
+        <w:pStyle w:val="Normal"/>
+      </w:pPr>
+      <w:r>
+        <w:rPr>
+          <w:rFonts w:ascii="Times New Roman" w:hAnsi="Times New Roman" w:eastAsia="Times New Roman"/>
+          <w:b w:val="0"/>
+          <w:i w:val="0"/>
+          <w:sz w:val="22"/>
+        </w:rPr>
+        <w:t>Figure 4.12 fig3_shap_summary_federated.png — federated SHAP summary.</w:t>
+      </w:r>
+    </w:p>
+    <w:p>
+      <w:r>
+        <w:rPr>
+          <w:rFonts w:ascii="Times New Roman" w:hAnsi="Times New Roman"/>
+          <w:sz w:val="22"/>
+        </w:rPr>
+        <w:t>Figure 4.13 per_client_shap_comparison.png — H3 per-client SHAP / Jaccard consistency.</w:t>
+      </w:r>
+    </w:p>
+    <w:p>
+      <w:r>
+        <w:rPr>
+          <w:rFonts w:ascii="Times New Roman" w:hAnsi="Times New Roman"/>
+          <w:sz w:val="22"/>
+        </w:rPr>
+        <w:t>Figure 4.14 Streamlit prototype screenshot — interactive PP-XAI demo.</w:t>
+      </w:r>
+    </w:p>
     <w:p>
       <w:r>
         <w:br w:type="page"/>
@@ -14670,34 +15628,82 @@
     </w:rPr>
   </w:style>
   <w:style w:type="paragraph" w:styleId="Heading1">
-    <w:name w:val="Heading 1"/>
+    <w:name w:val="heading 1"/>
     <w:basedOn w:val="Normal"/>
     <w:next w:val="Normal"/>
+    <w:link w:val="Heading1Char"/>
+    <w:uiPriority w:val="9"/>
     <w:qFormat/>
+    <w:rsid w:val="007A1768"/>
+    <w:pPr>
+      <w:keepNext/>
+      <w:keepLines/>
+      <w:pageBreakBefore/>
+      <w:numPr>
+        <w:numId w:val="1"/>
+      </w:numPr>
+      <w:spacing w:line="240" w:lineRule="auto"/>
+      <w:ind w:left="431" w:hanging="431"/>
+      <w:outlineLvl w:val="0"/>
+    </w:pPr>
     <w:rPr>
-      <w:color w:val="2E74B5"/>
+      <w:rFonts w:asciiTheme="majorHAnsi" w:eastAsiaTheme="majorEastAsia" w:hAnsiTheme="majorHAnsi" w:cstheme="majorBidi"/>
+      <w:b/>
+      <w:noProof/>
       <w:sz w:val="32"/>
       <w:szCs w:val="32"/>
     </w:rPr>
   </w:style>
   <w:style w:type="paragraph" w:styleId="Heading2">
-    <w:name w:val="Heading 2"/>
+    <w:name w:val="heading 2"/>
     <w:basedOn w:val="Normal"/>
     <w:next w:val="Normal"/>
+    <w:link w:val="Heading2Char"/>
+    <w:uiPriority w:val="9"/>
+    <w:unhideWhenUsed/>
     <w:qFormat/>
+    <w:rsid w:val="00A35434"/>
+    <w:pPr>
+      <w:keepNext/>
+      <w:keepLines/>
+      <w:numPr>
+        <w:ilvl w:val="1"/>
+        <w:numId w:val="1"/>
+      </w:numPr>
+      <w:spacing w:before="120" w:after="120" w:line="240" w:lineRule="auto"/>
+      <w:outlineLvl w:val="1"/>
+    </w:pPr>
     <w:rPr>
-      <w:color w:val="2E74B5"/>
-      <w:sz w:val="26"/>
+      <w:rFonts w:asciiTheme="majorHAnsi" w:eastAsiaTheme="majorEastAsia" w:hAnsiTheme="majorHAnsi" w:cstheme="majorBidi"/>
+      <w:b/>
+      <w:color w:val="000000" w:themeColor="text1"/>
+      <w:sz w:val="28"/>
       <w:szCs w:val="26"/>
     </w:rPr>
   </w:style>
   <w:style w:type="paragraph" w:styleId="Heading3">
-    <w:name w:val="Heading 3"/>
+    <w:name w:val="heading 3"/>
     <w:basedOn w:val="Normal"/>
     <w:next w:val="Normal"/>
+    <w:link w:val="Heading3Char"/>
+    <w:uiPriority w:val="9"/>
+    <w:unhideWhenUsed/>
     <w:qFormat/>
+    <w:rsid w:val="00A35434"/>
+    <w:pPr>
+      <w:keepNext/>
+      <w:keepLines/>
+      <w:numPr>
+        <w:ilvl w:val="2"/>
+        <w:numId w:val="1"/>
+      </w:numPr>
+      <w:spacing w:before="40" w:after="120" w:line="240" w:lineRule="auto"/>
+      <w:outlineLvl w:val="2"/>
+    </w:pPr>
     <w:rPr>
-      <w:color w:val="1F4D78"/>
+      <w:rFonts w:asciiTheme="majorHAnsi" w:eastAsiaTheme="majorEastAsia" w:hAnsiTheme="majorHAnsi" w:cstheme="majorBidi"/>
+      <w:b/>
+      <w:color w:val="000000" w:themeColor="text1"/>
       <w:sz w:val="24"/>
       <w:szCs w:val="24"/>
     </w:rPr>
@@ -14842,5 +15848,113 @@
       <w:szCs w:val="24"/>
     </w:rPr>
   </w:style>
+  <w:style w:type="paragraph" w:styleId="TOCHeading">
+    <w:name w:val="TOC Heading"/>
+    <w:basedOn w:val="Headingfrontmatter"/>
+    <w:next w:val="Normal"/>
+    <w:uiPriority w:val="39"/>
+    <w:unhideWhenUsed/>
+    <w:qFormat/>
+    <w:rsid w:val="004D4978"/>
+  </w:style>
+  <w:style w:type="paragraph" w:customStyle="1" w:styleId="Headingfrontmatter">
+    <w:name w:val="Heading front matter"/>
+    <w:basedOn w:val="Heading2"/>
+    <w:next w:val="Normal"/>
+    <w:qFormat/>
+    <w:rsid w:val="002B750B"/>
+    <w:pPr>
+      <w:pageBreakBefore/>
+      <w:numPr>
+        <w:ilvl w:val="0"/>
+        <w:numId w:val="0"/>
+      </w:numPr>
+    </w:pPr>
+    <w:rPr>
+      <w:sz w:val="32"/>
+      <w:lang w:val="fr-FR"/>
+    </w:rPr>
+  </w:style>
+  <w:style w:type="paragraph" w:customStyle="1" w:styleId="Headingbackmatter">
+    <w:name w:val="Heading back matter"/>
+    <w:basedOn w:val="Heading1"/>
+    <w:qFormat/>
+    <w:rsid w:val="009846EC"/>
+    <w:pPr>
+      <w:numPr>
+        <w:numId w:val="0"/>
+      </w:numPr>
+    </w:pPr>
+  </w:style>
+  <w:style w:type="paragraph" w:customStyle="1" w:styleId="Captionextra">
+    <w:name w:val="Caption extra"/>
+    <w:basedOn w:val="Caption"/>
+    <w:next w:val="Normal"/>
+    <w:qFormat/>
+    <w:rsid w:val="00E02105"/>
+    <w:rPr>
+      <w:noProof/>
+      <w:lang w:val="en-US"/>
+    </w:rPr>
+  </w:style>
+  <w:style w:type="character" w:customStyle="1" w:styleId="Heading1Char">
+    <w:name w:val="Heading 1 Char"/>
+    <w:basedOn w:val="DefaultParagraphFont"/>
+    <w:link w:val="Heading1"/>
+    <w:uiPriority w:val="9"/>
+    <w:rsid w:val="007A1768"/>
+    <w:rPr>
+      <w:rFonts w:asciiTheme="majorHAnsi" w:eastAsiaTheme="majorEastAsia" w:hAnsiTheme="majorHAnsi" w:cstheme="majorBidi"/>
+      <w:b/>
+      <w:noProof/>
+      <w:sz w:val="32"/>
+      <w:szCs w:val="32"/>
+    </w:rPr>
+  </w:style>
+  <w:style w:type="character" w:customStyle="1" w:styleId="Heading2Char">
+    <w:name w:val="Heading 2 Char"/>
+    <w:basedOn w:val="DefaultParagraphFont"/>
+    <w:link w:val="Heading2"/>
+    <w:uiPriority w:val="9"/>
+    <w:rsid w:val="00A35434"/>
+    <w:rPr>
+      <w:rFonts w:asciiTheme="majorHAnsi" w:eastAsiaTheme="majorEastAsia" w:hAnsiTheme="majorHAnsi" w:cstheme="majorBidi"/>
+      <w:b/>
+      <w:color w:val="000000" w:themeColor="text1"/>
+      <w:sz w:val="28"/>
+      <w:szCs w:val="26"/>
+    </w:rPr>
+  </w:style>
+  <w:style w:type="character" w:customStyle="1" w:styleId="Heading3Char">
+    <w:name w:val="Heading 3 Char"/>
+    <w:basedOn w:val="DefaultParagraphFont"/>
+    <w:link w:val="Heading3"/>
+    <w:uiPriority w:val="9"/>
+    <w:rsid w:val="00A35434"/>
+    <w:rPr>
+      <w:rFonts w:asciiTheme="majorHAnsi" w:eastAsiaTheme="majorEastAsia" w:hAnsiTheme="majorHAnsi" w:cstheme="majorBidi"/>
+      <w:b/>
+      <w:color w:val="000000" w:themeColor="text1"/>
+      <w:sz w:val="24"/>
+      <w:szCs w:val="24"/>
+    </w:rPr>
+  </w:style>
+  <w:style w:type="paragraph" w:styleId="Caption">
+    <w:name w:val="caption"/>
+    <w:basedOn w:val="Normal"/>
+    <w:next w:val="Normal"/>
+    <w:uiPriority w:val="35"/>
+    <w:unhideWhenUsed/>
+    <w:qFormat/>
+    <w:rsid w:val="00E02105"/>
+    <w:pPr>
+      <w:spacing w:line="240" w:lineRule="auto"/>
+    </w:pPr>
+    <w:rPr>
+      <w:iCs/>
+      <w:sz w:val="20"/>
+      <w:szCs w:val="18"/>
+    </w:rPr>
+  </w:style>
 </w:styles>
 </file>
</xml_diff>

<commit_message>
Enhance README with Streamlit demo instructions for Apple Silicon users, including alternative command for running the web app. Update binary report file for dissertation Assignment2.
</commit_message>
<xml_diff>
--- a/docs/reports/PP_XAI_Dissertation_Assignment2.docx
+++ b/docs/reports/PP_XAI_Dissertation_Assignment2.docx
@@ -225,7 +225,7 @@
         <w:rPr>
           <w:color w:val="000000"/>
         </w:rPr>
-        <w:t>August 2026</w:t>
+        <w:t>September 2026</w:t>
       </w:r>
     </w:p>
     <w:p>
@@ -6768,7 +6768,7 @@
         </w:tabs>
       </w:pPr>
       <w:r>
-        <w:t>Figure 4.10: Federated convergence over 20 rounds (FedAvg vs FedProx) with centralised MLP and Gradient Boosting RMSE re</w:t>
+        <w:t>Figure 4.10: Federated convergence over 20 rounds (FedAvg vs FedProx) with centralised MLP and Gradient Boosting RMSE reference lines</w:t>
       </w:r>
       <w:r>
         <w:tab/>
@@ -7087,7 +7087,7 @@
         </w:tabs>
       </w:pPr>
       <w:r>
-        <w:t>Table 4.5: Top-10 federated weighted SHAP rankings compared with centralised Random Forest mean |SHAP| (not the Gradient</w:t>
+        <w:t>Table 4.5: Top-10 federated weighted SHAP rankings compared with centralised Random Forest mean |SHAP| (not the Gradient Boosting KernelSHAP vectors used for H2)</w:t>
       </w:r>
       <w:r>
         <w:tab/>
@@ -18567,7 +18567,7 @@
         <w:rPr>
           <w:sz w:val="22"/>
         </w:rPr>
-        <w:t>Ministry of Housing, Communities and Local Government (2024–2026) Energy Performance of Buildings Data: England and Wales. Open Government Licence v3.0. Available at: https://get-energy-performance-data.communities.gov.uk/ (Accessed: August 2026).</w:t>
+        <w:t>Ministry of Housing, Communities and Local Government (2024–2026) Energy Performance of Buildings Data: England and Wales. Open Government Licence v3.0. Available at: https://get-energy-performance-data.communities.gov.uk/ (Accessed: September 2026).</w:t>
       </w:r>
     </w:p>
     <w:p>

</xml_diff>